<commit_message>
Updated docker deployment documentation with seeder.py
</commit_message>
<xml_diff>
--- a/VALID8_DOCKER_FINAL/📦 Deployment Guide for Docker.docx
+++ b/VALID8_DOCKER_FINAL/📦 Deployment Guide for Docker.docx
@@ -4,39 +4,213 @@
   <w:body>
     <w:p>
       <w:pPr>
+        <w:pStyle w:val="Heading2"/>
+        <w:rPr>
+          <w:sz w:val="28"/>
+          <w:szCs w:val="28"/>
+        </w:rPr>
+      </w:pPr>
+      <w:r>
+        <w:rPr>
+          <w:rFonts w:ascii="Segoe UI Symbol" w:hAnsi="Segoe UI Symbol" w:cs="Segoe UI Symbol"/>
+          <w:sz w:val="28"/>
+          <w:szCs w:val="28"/>
+        </w:rPr>
+        <w:t>📦</w:t>
+      </w:r>
+      <w:r>
+        <w:rPr>
+          <w:sz w:val="28"/>
+          <w:szCs w:val="28"/>
+        </w:rPr>
+        <w:t xml:space="preserve"> </w:t>
+      </w:r>
+      <w:r>
+        <w:rPr>
+          <w:rStyle w:val="Strong"/>
+          <w:b/>
+          <w:bCs/>
+          <w:sz w:val="28"/>
+          <w:szCs w:val="28"/>
+        </w:rPr>
+        <w:t>Deployment Guide for Docker-Based System</w:t>
+      </w:r>
+    </w:p>
+    <w:p>
+      <w:pPr>
         <w:pStyle w:val="Heading3"/>
-      </w:pPr>
-      <w:r>
-        <w:rPr>
-          <w:rFonts w:ascii="Segoe UI Symbol" w:hAnsi="Segoe UI Symbol" w:cs="Segoe UI Symbol"/>
-        </w:rPr>
-        <w:t>📦</w:t>
-      </w:r>
-      <w:r>
-        <w:t xml:space="preserve"> Deployment Guide for Docker-Based System</w:t>
-      </w:r>
-    </w:p>
-    <w:p>
-      <w:r>
+        <w:rPr>
+          <w:rFonts w:ascii="Times New Roman" w:hAnsi="Times New Roman" w:cs="Times New Roman"/>
+          <w:sz w:val="28"/>
+          <w:szCs w:val="28"/>
+        </w:rPr>
+      </w:pPr>
+      <w:r>
+        <w:rPr>
+          <w:rStyle w:val="Strong"/>
+          <w:rFonts w:ascii="Times New Roman" w:hAnsi="Times New Roman" w:cs="Times New Roman"/>
+          <w:b w:val="0"/>
+          <w:bCs w:val="0"/>
+          <w:sz w:val="28"/>
+          <w:szCs w:val="28"/>
+        </w:rPr>
+        <w:t>1. Clone the Repository</w:t>
+      </w:r>
+    </w:p>
+    <w:p>
+      <w:pPr>
+        <w:pStyle w:val="NormalWeb"/>
+        <w:rPr>
+          <w:sz w:val="28"/>
+          <w:szCs w:val="28"/>
+        </w:rPr>
+      </w:pPr>
+      <w:r>
+        <w:rPr>
+          <w:sz w:val="28"/>
+          <w:szCs w:val="28"/>
+        </w:rPr>
+        <w:t>Open a terminal and run the following commands to clone the project:</w:t>
+      </w:r>
+    </w:p>
+    <w:p>
+      <w:pPr>
+        <w:pStyle w:val="HTMLPreformatted"/>
+        <w:rPr>
+          <w:rStyle w:val="HTMLCode"/>
+          <w:rFonts w:ascii="Times New Roman" w:hAnsi="Times New Roman" w:cs="Times New Roman"/>
+          <w:color w:val="538135" w:themeColor="accent6" w:themeShade="BF"/>
+          <w:sz w:val="28"/>
+          <w:szCs w:val="28"/>
+        </w:rPr>
+      </w:pPr>
+      <w:proofErr w:type="spellStart"/>
+      <w:r>
+        <w:rPr>
+          <w:rStyle w:val="HTMLCode"/>
+          <w:rFonts w:ascii="Times New Roman" w:hAnsi="Times New Roman" w:cs="Times New Roman"/>
+          <w:color w:val="538135" w:themeColor="accent6" w:themeShade="BF"/>
+          <w:sz w:val="28"/>
+          <w:szCs w:val="28"/>
+        </w:rPr>
+        <w:t>git</w:t>
+      </w:r>
+      <w:proofErr w:type="spellEnd"/>
+      <w:r>
+        <w:rPr>
+          <w:rStyle w:val="HTMLCode"/>
+          <w:rFonts w:ascii="Times New Roman" w:hAnsi="Times New Roman" w:cs="Times New Roman"/>
+          <w:color w:val="538135" w:themeColor="accent6" w:themeShade="BF"/>
+          <w:sz w:val="28"/>
+          <w:szCs w:val="28"/>
+        </w:rPr>
+        <w:t xml:space="preserve"> </w:t>
+      </w:r>
+      <w:r>
+        <w:rPr>
+          <w:rStyle w:val="hljs-builtin"/>
+          <w:rFonts w:ascii="Times New Roman" w:hAnsi="Times New Roman" w:cs="Times New Roman"/>
+          <w:color w:val="538135" w:themeColor="accent6" w:themeShade="BF"/>
+          <w:sz w:val="28"/>
+          <w:szCs w:val="28"/>
+        </w:rPr>
+        <w:t>clone</w:t>
+      </w:r>
+      <w:r>
+        <w:rPr>
+          <w:rStyle w:val="HTMLCode"/>
+          <w:rFonts w:ascii="Times New Roman" w:hAnsi="Times New Roman" w:cs="Times New Roman"/>
+          <w:color w:val="538135" w:themeColor="accent6" w:themeShade="BF"/>
+          <w:sz w:val="28"/>
+          <w:szCs w:val="28"/>
+        </w:rPr>
+        <w:t xml:space="preserve"> https://github.com/KHRISTMAE/Valid8-Attendance-Recognition-System.git  </w:t>
+      </w:r>
+    </w:p>
+    <w:p>
+      <w:pPr>
+        <w:pStyle w:val="HTMLPreformatted"/>
+        <w:rPr>
+          <w:rStyle w:val="HTMLCode"/>
+          <w:rFonts w:ascii="Times New Roman" w:hAnsi="Times New Roman" w:cs="Times New Roman"/>
+          <w:color w:val="538135" w:themeColor="accent6" w:themeShade="BF"/>
+          <w:sz w:val="28"/>
+          <w:szCs w:val="28"/>
+        </w:rPr>
+      </w:pPr>
+      <w:r>
+        <w:rPr>
+          <w:rStyle w:val="hljs-builtin"/>
+          <w:rFonts w:ascii="Times New Roman" w:hAnsi="Times New Roman" w:cs="Times New Roman"/>
+          <w:color w:val="538135" w:themeColor="accent6" w:themeShade="BF"/>
+          <w:sz w:val="28"/>
+          <w:szCs w:val="28"/>
+        </w:rPr>
+        <w:t>cd</w:t>
+      </w:r>
+      <w:r>
+        <w:rPr>
+          <w:rStyle w:val="HTMLCode"/>
+          <w:rFonts w:ascii="Times New Roman" w:hAnsi="Times New Roman" w:cs="Times New Roman"/>
+          <w:color w:val="538135" w:themeColor="accent6" w:themeShade="BF"/>
+          <w:sz w:val="28"/>
+          <w:szCs w:val="28"/>
+        </w:rPr>
+        <w:t xml:space="preserve"> Valid8-Attendance-Recognition-System  </w:t>
+      </w:r>
+    </w:p>
+    <w:p>
+      <w:pPr>
+        <w:rPr>
+          <w:rFonts w:ascii="Times New Roman" w:hAnsi="Times New Roman" w:cs="Times New Roman"/>
+          <w:sz w:val="28"/>
+        </w:rPr>
+      </w:pPr>
+      <w:r>
+        <w:rPr>
+          <w:rFonts w:ascii="Times New Roman" w:hAnsi="Times New Roman" w:cs="Times New Roman"/>
+          <w:sz w:val="28"/>
+        </w:rPr>
         <w:pict>
-          <v:rect id="_x0000_i1039" style="width:0;height:1.5pt" o:hralign="center" o:hrstd="t" o:hr="t" fillcolor="#a0a0a0" stroked="f"/>
+          <v:rect id="_x0000_i1041" style="width:0;height:1.5pt" o:hralign="center" o:hrstd="t" o:hr="t" fillcolor="#a0a0a0" stroked="f"/>
         </w:pict>
       </w:r>
     </w:p>
     <w:p>
       <w:pPr>
-        <w:pStyle w:val="Heading4"/>
-      </w:pPr>
-      <w:r>
-        <w:t>1. Clone the Repository</w:t>
+        <w:pStyle w:val="Heading3"/>
+        <w:rPr>
+          <w:rFonts w:ascii="Times New Roman" w:hAnsi="Times New Roman" w:cs="Times New Roman"/>
+          <w:sz w:val="28"/>
+          <w:szCs w:val="28"/>
+        </w:rPr>
+      </w:pPr>
+      <w:r>
+        <w:rPr>
+          <w:rStyle w:val="Strong"/>
+          <w:rFonts w:ascii="Times New Roman" w:hAnsi="Times New Roman" w:cs="Times New Roman"/>
+          <w:b w:val="0"/>
+          <w:bCs w:val="0"/>
+          <w:sz w:val="28"/>
+          <w:szCs w:val="28"/>
+        </w:rPr>
+        <w:t>2. Build and Start Docker Containers</w:t>
       </w:r>
     </w:p>
     <w:p>
       <w:pPr>
         <w:pStyle w:val="NormalWeb"/>
-      </w:pPr>
-      <w:r>
-        <w:t>Open a terminal and run the following commands to clone the project:</w:t>
+        <w:rPr>
+          <w:sz w:val="28"/>
+          <w:szCs w:val="28"/>
+        </w:rPr>
+      </w:pPr>
+      <w:r>
+        <w:rPr>
+          <w:sz w:val="28"/>
+          <w:szCs w:val="28"/>
+        </w:rPr>
+        <w:t>Make sure Docker and Docker Compose are installed. To build and start the services, run:</w:t>
       </w:r>
     </w:p>
     <w:p>
@@ -44,150 +218,98 @@
         <w:pStyle w:val="HTMLPreformatted"/>
         <w:rPr>
           <w:rStyle w:val="HTMLCode"/>
-          <w:color w:val="323E4F" w:themeColor="text2" w:themeShade="BF"/>
+          <w:rFonts w:ascii="Times New Roman" w:hAnsi="Times New Roman" w:cs="Times New Roman"/>
+          <w:color w:val="538135" w:themeColor="accent6" w:themeShade="BF"/>
+          <w:sz w:val="28"/>
+          <w:szCs w:val="28"/>
         </w:rPr>
       </w:pPr>
       <w:proofErr w:type="spellStart"/>
       <w:r>
         <w:rPr>
           <w:rStyle w:val="HTMLCode"/>
-          <w:color w:val="323E4F" w:themeColor="text2" w:themeShade="BF"/>
-        </w:rPr>
-        <w:t>git</w:t>
+          <w:rFonts w:ascii="Times New Roman" w:hAnsi="Times New Roman" w:cs="Times New Roman"/>
+          <w:color w:val="538135" w:themeColor="accent6" w:themeShade="BF"/>
+          <w:sz w:val="28"/>
+          <w:szCs w:val="28"/>
+        </w:rPr>
+        <w:t>docker</w:t>
       </w:r>
       <w:proofErr w:type="spellEnd"/>
       <w:r>
         <w:rPr>
           <w:rStyle w:val="HTMLCode"/>
-          <w:color w:val="323E4F" w:themeColor="text2" w:themeShade="BF"/>
-        </w:rPr>
-        <w:t xml:space="preserve"> </w:t>
-      </w:r>
-      <w:r>
-        <w:rPr>
-          <w:rStyle w:val="hljs-builtin"/>
-          <w:color w:val="323E4F" w:themeColor="text2" w:themeShade="BF"/>
-        </w:rPr>
-        <w:t>clone</w:t>
-      </w:r>
-      <w:r>
+          <w:rFonts w:ascii="Times New Roman" w:hAnsi="Times New Roman" w:cs="Times New Roman"/>
+          <w:color w:val="538135" w:themeColor="accent6" w:themeShade="BF"/>
+          <w:sz w:val="28"/>
+          <w:szCs w:val="28"/>
+        </w:rPr>
+        <w:t xml:space="preserve">-compose up --build  </w:t>
+      </w:r>
+    </w:p>
+    <w:p>
+      <w:pPr>
+        <w:pStyle w:val="NormalWeb"/>
+        <w:rPr>
+          <w:sz w:val="28"/>
+          <w:szCs w:val="28"/>
+        </w:rPr>
+      </w:pPr>
+      <w:r>
+        <w:rPr>
+          <w:sz w:val="28"/>
+          <w:szCs w:val="28"/>
+        </w:rPr>
+        <w:t>To run the containers in the background:</w:t>
+      </w:r>
+    </w:p>
+    <w:p>
+      <w:pPr>
+        <w:pStyle w:val="HTMLPreformatted"/>
         <w:rPr>
           <w:rStyle w:val="HTMLCode"/>
-          <w:color w:val="323E4F" w:themeColor="text2" w:themeShade="BF"/>
-        </w:rPr>
-        <w:t xml:space="preserve"> https://github.com/KHRISTMAE/Valid8-Attendance-Recognition-System.git</w:t>
-      </w:r>
-    </w:p>
-    <w:p>
-      <w:pPr>
-        <w:pStyle w:val="HTMLPreformatted"/>
+          <w:rFonts w:ascii="Times New Roman" w:hAnsi="Times New Roman" w:cs="Times New Roman"/>
+          <w:color w:val="538135" w:themeColor="accent6" w:themeShade="BF"/>
+          <w:sz w:val="28"/>
+          <w:szCs w:val="28"/>
+        </w:rPr>
+      </w:pPr>
+      <w:proofErr w:type="spellStart"/>
+      <w:r>
         <w:rPr>
           <w:rStyle w:val="HTMLCode"/>
-          <w:color w:val="323E4F" w:themeColor="text2" w:themeShade="BF"/>
-        </w:rPr>
-      </w:pPr>
-      <w:r>
-        <w:rPr>
-          <w:rStyle w:val="hljs-builtin"/>
-          <w:color w:val="323E4F" w:themeColor="text2" w:themeShade="BF"/>
-        </w:rPr>
-        <w:t>cd</w:t>
-      </w:r>
+          <w:rFonts w:ascii="Times New Roman" w:hAnsi="Times New Roman" w:cs="Times New Roman"/>
+          <w:color w:val="538135" w:themeColor="accent6" w:themeShade="BF"/>
+          <w:sz w:val="28"/>
+          <w:szCs w:val="28"/>
+        </w:rPr>
+        <w:t>docker</w:t>
+      </w:r>
+      <w:proofErr w:type="spellEnd"/>
       <w:r>
         <w:rPr>
           <w:rStyle w:val="HTMLCode"/>
-          <w:color w:val="323E4F" w:themeColor="text2" w:themeShade="BF"/>
-        </w:rPr>
-        <w:t xml:space="preserve"> Valid8-Attendance-Recognition-System</w:t>
-      </w:r>
-    </w:p>
-    <w:p>
-      <w:r>
-        <w:pict>
-          <v:rect id="_x0000_i1040" style="width:0;height:1.5pt" o:hralign="center" o:hrstd="t" o:hr="t" fillcolor="#a0a0a0" stroked="f"/>
-        </w:pict>
-      </w:r>
-    </w:p>
-    <w:p>
-      <w:pPr>
-        <w:pStyle w:val="Heading4"/>
-      </w:pPr>
-      <w:r>
-        <w:t>2. Build and Start Docker Containers</w:t>
-      </w:r>
-      <w:bookmarkStart w:id="0" w:name="_GoBack"/>
-      <w:bookmarkEnd w:id="0"/>
+          <w:rFonts w:ascii="Times New Roman" w:hAnsi="Times New Roman" w:cs="Times New Roman"/>
+          <w:color w:val="538135" w:themeColor="accent6" w:themeShade="BF"/>
+          <w:sz w:val="28"/>
+          <w:szCs w:val="28"/>
+        </w:rPr>
+        <w:t xml:space="preserve">-compose up -d --build  </w:t>
+      </w:r>
     </w:p>
     <w:p>
       <w:pPr>
         <w:pStyle w:val="NormalWeb"/>
-      </w:pPr>
-      <w:r>
-        <w:t>Make sure Docker and Docker Compose are installed. To build and start the services, run:</w:t>
-      </w:r>
-    </w:p>
-    <w:p>
-      <w:pPr>
-        <w:pStyle w:val="HTMLPreformatted"/>
-        <w:rPr>
-          <w:rStyle w:val="HTMLCode"/>
-          <w:color w:val="323E4F" w:themeColor="text2" w:themeShade="BF"/>
-        </w:rPr>
-      </w:pPr>
-      <w:proofErr w:type="spellStart"/>
-      <w:r>
-        <w:rPr>
-          <w:rStyle w:val="HTMLCode"/>
-          <w:color w:val="323E4F" w:themeColor="text2" w:themeShade="BF"/>
-        </w:rPr>
-        <w:t>docker</w:t>
-      </w:r>
-      <w:proofErr w:type="spellEnd"/>
-      <w:r>
-        <w:rPr>
-          <w:rStyle w:val="HTMLCode"/>
-          <w:color w:val="323E4F" w:themeColor="text2" w:themeShade="BF"/>
-        </w:rPr>
-        <w:t>-compose up --build</w:t>
-      </w:r>
-    </w:p>
-    <w:p>
-      <w:pPr>
-        <w:pStyle w:val="NormalWeb"/>
-      </w:pPr>
-      <w:r>
-        <w:t>To run the containers in the background:</w:t>
-      </w:r>
-    </w:p>
-    <w:p>
-      <w:pPr>
-        <w:pStyle w:val="HTMLPreformatted"/>
-        <w:rPr>
-          <w:rStyle w:val="HTMLCode"/>
-        </w:rPr>
-      </w:pPr>
-      <w:proofErr w:type="spellStart"/>
-      <w:r>
-        <w:rPr>
-          <w:rStyle w:val="HTMLCode"/>
-          <w:color w:val="323E4F" w:themeColor="text2" w:themeShade="BF"/>
-        </w:rPr>
-        <w:t>docker</w:t>
-      </w:r>
-      <w:proofErr w:type="spellEnd"/>
-      <w:r>
-        <w:rPr>
-          <w:rStyle w:val="HTMLCode"/>
-          <w:color w:val="323E4F" w:themeColor="text2" w:themeShade="BF"/>
-        </w:rPr>
-        <w:t>-compose up -d --build</w:t>
-      </w:r>
-    </w:p>
-    <w:p>
-      <w:pPr>
-        <w:pStyle w:val="NormalWeb"/>
-      </w:pPr>
-      <w:r>
+        <w:rPr>
+          <w:sz w:val="28"/>
+          <w:szCs w:val="28"/>
+        </w:rPr>
+      </w:pPr>
+      <w:r>
+        <w:rPr>
+          <w:sz w:val="28"/>
+          <w:szCs w:val="28"/>
+        </w:rPr>
         <w:t>This will start the following services:</w:t>
       </w:r>
     </w:p>
@@ -196,26 +318,33 @@
         <w:pStyle w:val="NormalWeb"/>
         <w:numPr>
           <w:ilvl w:val="0"/>
-          <w:numId w:val="4"/>
+          <w:numId w:val="9"/>
         </w:numPr>
-      </w:pPr>
-      <w:r>
-        <w:rPr>
-          <w:rStyle w:val="Strong"/>
+        <w:rPr>
+          <w:sz w:val="28"/>
+          <w:szCs w:val="28"/>
+        </w:rPr>
+      </w:pPr>
+      <w:r>
+        <w:rPr>
+          <w:sz w:val="28"/>
+          <w:szCs w:val="28"/>
         </w:rPr>
         <w:t>Backend (</w:t>
       </w:r>
       <w:proofErr w:type="spellStart"/>
       <w:r>
         <w:rPr>
-          <w:rStyle w:val="Strong"/>
+          <w:sz w:val="28"/>
+          <w:szCs w:val="28"/>
         </w:rPr>
         <w:t>FastAPI</w:t>
       </w:r>
       <w:proofErr w:type="spellEnd"/>
       <w:r>
         <w:rPr>
-          <w:rStyle w:val="Strong"/>
+          <w:sz w:val="28"/>
+          <w:szCs w:val="28"/>
         </w:rPr>
         <w:t>)</w:t>
       </w:r>
@@ -225,26 +354,33 @@
         <w:pStyle w:val="NormalWeb"/>
         <w:numPr>
           <w:ilvl w:val="0"/>
-          <w:numId w:val="4"/>
+          <w:numId w:val="9"/>
         </w:numPr>
-      </w:pPr>
-      <w:r>
-        <w:rPr>
-          <w:rStyle w:val="Strong"/>
+        <w:rPr>
+          <w:sz w:val="28"/>
+          <w:szCs w:val="28"/>
+        </w:rPr>
+      </w:pPr>
+      <w:r>
+        <w:rPr>
+          <w:sz w:val="28"/>
+          <w:szCs w:val="28"/>
         </w:rPr>
         <w:t>Frontend (</w:t>
       </w:r>
       <w:proofErr w:type="spellStart"/>
       <w:r>
         <w:rPr>
-          <w:rStyle w:val="Strong"/>
+          <w:sz w:val="28"/>
+          <w:szCs w:val="28"/>
         </w:rPr>
         <w:t>Vite</w:t>
       </w:r>
       <w:proofErr w:type="spellEnd"/>
       <w:r>
         <w:rPr>
-          <w:rStyle w:val="Strong"/>
+          <w:sz w:val="28"/>
+          <w:szCs w:val="28"/>
         </w:rPr>
         <w:t xml:space="preserve"> or similar)</w:t>
       </w:r>
@@ -254,12 +390,17 @@
         <w:pStyle w:val="NormalWeb"/>
         <w:numPr>
           <w:ilvl w:val="0"/>
-          <w:numId w:val="4"/>
+          <w:numId w:val="9"/>
         </w:numPr>
-      </w:pPr>
-      <w:r>
-        <w:rPr>
-          <w:rStyle w:val="Strong"/>
+        <w:rPr>
+          <w:sz w:val="28"/>
+          <w:szCs w:val="28"/>
+        </w:rPr>
+      </w:pPr>
+      <w:r>
+        <w:rPr>
+          <w:sz w:val="28"/>
+          <w:szCs w:val="28"/>
         </w:rPr>
         <w:t>PostgreSQL database</w:t>
       </w:r>
@@ -269,96 +410,35 @@
         <w:pStyle w:val="NormalWeb"/>
         <w:numPr>
           <w:ilvl w:val="0"/>
-          <w:numId w:val="4"/>
+          <w:numId w:val="9"/>
         </w:numPr>
+        <w:rPr>
+          <w:sz w:val="28"/>
+          <w:szCs w:val="28"/>
+        </w:rPr>
       </w:pPr>
       <w:proofErr w:type="spellStart"/>
       <w:r>
         <w:rPr>
-          <w:rStyle w:val="Strong"/>
+          <w:sz w:val="28"/>
+          <w:szCs w:val="28"/>
         </w:rPr>
         <w:t>pgAdmin</w:t>
       </w:r>
       <w:proofErr w:type="spellEnd"/>
     </w:p>
     <w:p>
-      <w:r>
-        <w:pict>
-          <v:rect id="_x0000_i1041" style="width:0;height:1.5pt" o:hralign="center" o:hrstd="t" o:hr="t" fillcolor="#a0a0a0" stroked="f"/>
-        </w:pict>
-      </w:r>
-    </w:p>
-    <w:p>
-      <w:pPr>
-        <w:pStyle w:val="Heading4"/>
-      </w:pPr>
-      <w:r>
-        <w:t>3. Run Database Migrations</w:t>
-      </w:r>
-    </w:p>
-    <w:p>
-      <w:pPr>
-        <w:pStyle w:val="NormalWeb"/>
-      </w:pPr>
-      <w:r>
-        <w:t>After the containers are running, apply the database migrations using Alembic:</w:t>
-      </w:r>
-    </w:p>
-    <w:p>
-      <w:pPr>
-        <w:pStyle w:val="HTMLPreformatted"/>
-        <w:rPr>
-          <w:rStyle w:val="HTMLCode"/>
-        </w:rPr>
-      </w:pPr>
-      <w:proofErr w:type="spellStart"/>
-      <w:r>
-        <w:rPr>
-          <w:rStyle w:val="HTMLCode"/>
-          <w:color w:val="323E4F" w:themeColor="text2" w:themeShade="BF"/>
-        </w:rPr>
-        <w:t>docker</w:t>
-      </w:r>
-      <w:proofErr w:type="spellEnd"/>
-      <w:r>
-        <w:rPr>
-          <w:rStyle w:val="HTMLCode"/>
-          <w:color w:val="323E4F" w:themeColor="text2" w:themeShade="BF"/>
-        </w:rPr>
-        <w:t xml:space="preserve"> </w:t>
-      </w:r>
-      <w:r>
-        <w:rPr>
-          <w:rStyle w:val="hljs-builtin"/>
-          <w:color w:val="323E4F" w:themeColor="text2" w:themeShade="BF"/>
-        </w:rPr>
-        <w:t>exec</w:t>
-      </w:r>
-      <w:r>
-        <w:rPr>
-          <w:rStyle w:val="HTMLCode"/>
-          <w:color w:val="323E4F" w:themeColor="text2" w:themeShade="BF"/>
-        </w:rPr>
-        <w:t xml:space="preserve"> -it backend_v2 alembic upgrade </w:t>
-      </w:r>
-      <w:r>
-        <w:rPr>
-          <w:rStyle w:val="hljs-builtin"/>
-          <w:color w:val="323E4F" w:themeColor="text2" w:themeShade="BF"/>
-        </w:rPr>
-        <w:t>head</w:t>
-      </w:r>
-    </w:p>
-    <w:p>
-      <w:pPr>
-        <w:pStyle w:val="NormalWeb"/>
-      </w:pPr>
-      <w:r>
-        <w:t>This will create the necessary tables in the PostgreSQL database.</w:t>
-      </w:r>
-    </w:p>
-    <w:p>
-      <w:r>
+      <w:pPr>
+        <w:rPr>
+          <w:rFonts w:ascii="Times New Roman" w:hAnsi="Times New Roman" w:cs="Times New Roman"/>
+          <w:sz w:val="28"/>
+        </w:rPr>
+      </w:pPr>
+      <w:r>
+        <w:rPr>
+          <w:rFonts w:ascii="Times New Roman" w:hAnsi="Times New Roman" w:cs="Times New Roman"/>
+          <w:sz w:val="28"/>
+        </w:rPr>
         <w:pict>
           <v:rect id="_x0000_i1042" style="width:0;height:1.5pt" o:hralign="center" o:hrstd="t" o:hr="t" fillcolor="#a0a0a0" stroked="f"/>
         </w:pict>
@@ -366,17 +446,339 @@
     </w:p>
     <w:p>
       <w:pPr>
-        <w:pStyle w:val="Heading4"/>
-      </w:pPr>
-      <w:r>
+        <w:pStyle w:val="Heading3"/>
+        <w:rPr>
+          <w:rFonts w:ascii="Times New Roman" w:hAnsi="Times New Roman" w:cs="Times New Roman"/>
+          <w:sz w:val="28"/>
+          <w:szCs w:val="28"/>
+        </w:rPr>
+      </w:pPr>
+      <w:r>
+        <w:rPr>
+          <w:rStyle w:val="Strong"/>
+          <w:rFonts w:ascii="Times New Roman" w:hAnsi="Times New Roman" w:cs="Times New Roman"/>
+          <w:b w:val="0"/>
+          <w:bCs w:val="0"/>
+          <w:sz w:val="28"/>
+          <w:szCs w:val="28"/>
+        </w:rPr>
+        <w:t>3. Run Database Migrations</w:t>
+      </w:r>
+    </w:p>
+    <w:p>
+      <w:pPr>
+        <w:pStyle w:val="NormalWeb"/>
+        <w:rPr>
+          <w:sz w:val="28"/>
+          <w:szCs w:val="28"/>
+        </w:rPr>
+      </w:pPr>
+      <w:r>
+        <w:rPr>
+          <w:sz w:val="28"/>
+          <w:szCs w:val="28"/>
+        </w:rPr>
+        <w:t>After the containers are running, apply the database migrations using Alembic:</w:t>
+      </w:r>
+    </w:p>
+    <w:p>
+      <w:pPr>
+        <w:pStyle w:val="HTMLPreformatted"/>
+        <w:rPr>
+          <w:rStyle w:val="HTMLCode"/>
+          <w:rFonts w:ascii="Times New Roman" w:hAnsi="Times New Roman" w:cs="Times New Roman"/>
+          <w:color w:val="538135" w:themeColor="accent6" w:themeShade="BF"/>
+          <w:sz w:val="28"/>
+          <w:szCs w:val="28"/>
+        </w:rPr>
+      </w:pPr>
+      <w:proofErr w:type="spellStart"/>
+      <w:r>
+        <w:rPr>
+          <w:rStyle w:val="HTMLCode"/>
+          <w:rFonts w:ascii="Times New Roman" w:hAnsi="Times New Roman" w:cs="Times New Roman"/>
+          <w:color w:val="538135" w:themeColor="accent6" w:themeShade="BF"/>
+          <w:sz w:val="28"/>
+          <w:szCs w:val="28"/>
+        </w:rPr>
+        <w:t>docker</w:t>
+      </w:r>
+      <w:proofErr w:type="spellEnd"/>
+      <w:r>
+        <w:rPr>
+          <w:rStyle w:val="HTMLCode"/>
+          <w:rFonts w:ascii="Times New Roman" w:hAnsi="Times New Roman" w:cs="Times New Roman"/>
+          <w:color w:val="538135" w:themeColor="accent6" w:themeShade="BF"/>
+          <w:sz w:val="28"/>
+          <w:szCs w:val="28"/>
+        </w:rPr>
+        <w:t xml:space="preserve"> </w:t>
+      </w:r>
+      <w:r>
+        <w:rPr>
+          <w:rStyle w:val="hljs-builtin"/>
+          <w:rFonts w:ascii="Times New Roman" w:hAnsi="Times New Roman" w:cs="Times New Roman"/>
+          <w:color w:val="538135" w:themeColor="accent6" w:themeShade="BF"/>
+          <w:sz w:val="28"/>
+          <w:szCs w:val="28"/>
+        </w:rPr>
+        <w:t>exec</w:t>
+      </w:r>
+      <w:r>
+        <w:rPr>
+          <w:rStyle w:val="HTMLCode"/>
+          <w:rFonts w:ascii="Times New Roman" w:hAnsi="Times New Roman" w:cs="Times New Roman"/>
+          <w:color w:val="538135" w:themeColor="accent6" w:themeShade="BF"/>
+          <w:sz w:val="28"/>
+          <w:szCs w:val="28"/>
+        </w:rPr>
+        <w:t xml:space="preserve"> -it backend_v2 alembic upgrade </w:t>
+      </w:r>
+      <w:r>
+        <w:rPr>
+          <w:rStyle w:val="hljs-builtin"/>
+          <w:rFonts w:ascii="Times New Roman" w:hAnsi="Times New Roman" w:cs="Times New Roman"/>
+          <w:color w:val="538135" w:themeColor="accent6" w:themeShade="BF"/>
+          <w:sz w:val="28"/>
+          <w:szCs w:val="28"/>
+        </w:rPr>
+        <w:t>head</w:t>
+      </w:r>
+      <w:r>
+        <w:rPr>
+          <w:rStyle w:val="HTMLCode"/>
+          <w:rFonts w:ascii="Times New Roman" w:hAnsi="Times New Roman" w:cs="Times New Roman"/>
+          <w:color w:val="538135" w:themeColor="accent6" w:themeShade="BF"/>
+          <w:sz w:val="28"/>
+          <w:szCs w:val="28"/>
+        </w:rPr>
+        <w:t xml:space="preserve">  </w:t>
+      </w:r>
+    </w:p>
+    <w:p>
+      <w:pPr>
+        <w:pStyle w:val="NormalWeb"/>
+        <w:rPr>
+          <w:sz w:val="28"/>
+          <w:szCs w:val="28"/>
+        </w:rPr>
+      </w:pPr>
+      <w:r>
+        <w:rPr>
+          <w:sz w:val="28"/>
+          <w:szCs w:val="28"/>
+        </w:rPr>
+        <w:t>This will create the necessary tables in the PostgreSQL database.</w:t>
+      </w:r>
+    </w:p>
+    <w:p>
+      <w:pPr>
+        <w:rPr>
+          <w:rFonts w:ascii="Times New Roman" w:hAnsi="Times New Roman" w:cs="Times New Roman"/>
+          <w:sz w:val="28"/>
+        </w:rPr>
+      </w:pPr>
+      <w:r>
+        <w:rPr>
+          <w:rFonts w:ascii="Times New Roman" w:hAnsi="Times New Roman" w:cs="Times New Roman"/>
+          <w:sz w:val="28"/>
+        </w:rPr>
+        <w:pict>
+          <v:rect id="_x0000_i1043" style="width:0;height:1.5pt" o:hralign="center" o:hrstd="t" o:hr="t" fillcolor="#a0a0a0" stroked="f"/>
+        </w:pict>
+      </w:r>
+    </w:p>
+    <w:p>
+      <w:pPr>
+        <w:pStyle w:val="Heading3"/>
+        <w:rPr>
+          <w:rFonts w:ascii="Times New Roman" w:hAnsi="Times New Roman" w:cs="Times New Roman"/>
+          <w:sz w:val="28"/>
+          <w:szCs w:val="28"/>
+        </w:rPr>
+      </w:pPr>
+      <w:r>
+        <w:rPr>
+          <w:rFonts w:ascii="Segoe UI Symbol" w:hAnsi="Segoe UI Symbol" w:cs="Segoe UI Symbol"/>
+          <w:sz w:val="28"/>
+          <w:szCs w:val="28"/>
+        </w:rPr>
+        <w:lastRenderedPageBreak/>
+        <w:t>✅</w:t>
+      </w:r>
+      <w:r>
+        <w:rPr>
+          <w:rFonts w:ascii="Times New Roman" w:hAnsi="Times New Roman" w:cs="Times New Roman"/>
+          <w:sz w:val="28"/>
+          <w:szCs w:val="28"/>
+        </w:rPr>
+        <w:t xml:space="preserve"> </w:t>
+      </w:r>
+      <w:r>
+        <w:rPr>
+          <w:rStyle w:val="Strong"/>
+          <w:rFonts w:ascii="Times New Roman" w:hAnsi="Times New Roman" w:cs="Times New Roman"/>
+          <w:b w:val="0"/>
+          <w:bCs w:val="0"/>
+          <w:sz w:val="28"/>
+          <w:szCs w:val="28"/>
+        </w:rPr>
+        <w:t>3.5. Seed the Database with Initial Users</w:t>
+      </w:r>
+    </w:p>
+    <w:p>
+      <w:pPr>
+        <w:pStyle w:val="NormalWeb"/>
+        <w:rPr>
+          <w:sz w:val="28"/>
+          <w:szCs w:val="28"/>
+        </w:rPr>
+      </w:pPr>
+      <w:r>
+        <w:rPr>
+          <w:sz w:val="28"/>
+          <w:szCs w:val="28"/>
+        </w:rPr>
+        <w:t>To prepopulate the database with user accounts (e.g., admin or test users), run the seed script:</w:t>
+      </w:r>
+    </w:p>
+    <w:p>
+      <w:pPr>
+        <w:pStyle w:val="HTMLPreformatted"/>
+        <w:rPr>
+          <w:rStyle w:val="HTMLCode"/>
+          <w:rFonts w:ascii="Times New Roman" w:hAnsi="Times New Roman" w:cs="Times New Roman"/>
+          <w:color w:val="538135" w:themeColor="accent6" w:themeShade="BF"/>
+          <w:sz w:val="28"/>
+          <w:szCs w:val="28"/>
+        </w:rPr>
+      </w:pPr>
+      <w:proofErr w:type="spellStart"/>
+      <w:r>
+        <w:rPr>
+          <w:rStyle w:val="HTMLCode"/>
+          <w:rFonts w:ascii="Times New Roman" w:hAnsi="Times New Roman" w:cs="Times New Roman"/>
+          <w:color w:val="538135" w:themeColor="accent6" w:themeShade="BF"/>
+          <w:sz w:val="28"/>
+          <w:szCs w:val="28"/>
+        </w:rPr>
+        <w:t>docker</w:t>
+      </w:r>
+      <w:proofErr w:type="spellEnd"/>
+      <w:r>
+        <w:rPr>
+          <w:rStyle w:val="HTMLCode"/>
+          <w:rFonts w:ascii="Times New Roman" w:hAnsi="Times New Roman" w:cs="Times New Roman"/>
+          <w:color w:val="538135" w:themeColor="accent6" w:themeShade="BF"/>
+          <w:sz w:val="28"/>
+          <w:szCs w:val="28"/>
+        </w:rPr>
+        <w:t xml:space="preserve"> </w:t>
+      </w:r>
+      <w:r>
+        <w:rPr>
+          <w:rStyle w:val="hljs-builtin"/>
+          <w:rFonts w:ascii="Times New Roman" w:hAnsi="Times New Roman" w:cs="Times New Roman"/>
+          <w:color w:val="538135" w:themeColor="accent6" w:themeShade="BF"/>
+          <w:sz w:val="28"/>
+          <w:szCs w:val="28"/>
+        </w:rPr>
+        <w:t>exec</w:t>
+      </w:r>
+      <w:r>
+        <w:rPr>
+          <w:rStyle w:val="HTMLCode"/>
+          <w:rFonts w:ascii="Times New Roman" w:hAnsi="Times New Roman" w:cs="Times New Roman"/>
+          <w:color w:val="538135" w:themeColor="accent6" w:themeShade="BF"/>
+          <w:sz w:val="28"/>
+          <w:szCs w:val="28"/>
+        </w:rPr>
+        <w:t xml:space="preserve"> -it backend_v2 python seed.py  </w:t>
+      </w:r>
+    </w:p>
+    <w:p>
+      <w:pPr>
+        <w:pStyle w:val="NormalWeb"/>
+        <w:rPr>
+          <w:sz w:val="28"/>
+          <w:szCs w:val="28"/>
+        </w:rPr>
+      </w:pPr>
+      <w:r>
+        <w:rPr>
+          <w:sz w:val="28"/>
+          <w:szCs w:val="28"/>
+        </w:rPr>
+        <w:t xml:space="preserve">This ensures the </w:t>
+      </w:r>
+      <w:r>
+        <w:rPr>
+          <w:rStyle w:val="HTMLCode"/>
+          <w:rFonts w:ascii="Times New Roman" w:hAnsi="Times New Roman" w:cs="Times New Roman"/>
+          <w:sz w:val="28"/>
+          <w:szCs w:val="28"/>
+        </w:rPr>
+        <w:t>users</w:t>
+      </w:r>
+      <w:r>
+        <w:rPr>
+          <w:sz w:val="28"/>
+          <w:szCs w:val="28"/>
+        </w:rPr>
+        <w:t xml:space="preserve"> table is populated with default data after migrations.</w:t>
+      </w:r>
+    </w:p>
+    <w:p>
+      <w:pPr>
+        <w:rPr>
+          <w:rFonts w:ascii="Times New Roman" w:hAnsi="Times New Roman" w:cs="Times New Roman"/>
+          <w:sz w:val="28"/>
+        </w:rPr>
+      </w:pPr>
+      <w:r>
+        <w:rPr>
+          <w:rFonts w:ascii="Times New Roman" w:hAnsi="Times New Roman" w:cs="Times New Roman"/>
+          <w:sz w:val="28"/>
+        </w:rPr>
+        <w:pict>
+          <v:rect id="_x0000_i1044" style="width:0;height:1.5pt" o:hralign="center" o:hrstd="t" o:hr="t" fillcolor="#a0a0a0" stroked="f"/>
+        </w:pict>
+      </w:r>
+    </w:p>
+    <w:p>
+      <w:pPr>
+        <w:pStyle w:val="Heading3"/>
+        <w:rPr>
+          <w:rFonts w:ascii="Times New Roman" w:hAnsi="Times New Roman" w:cs="Times New Roman"/>
+          <w:sz w:val="28"/>
+          <w:szCs w:val="28"/>
+        </w:rPr>
+      </w:pPr>
+      <w:r>
+        <w:rPr>
+          <w:rStyle w:val="Strong"/>
+          <w:rFonts w:ascii="Times New Roman" w:hAnsi="Times New Roman" w:cs="Times New Roman"/>
+          <w:b w:val="0"/>
+          <w:bCs w:val="0"/>
+          <w:sz w:val="28"/>
+          <w:szCs w:val="28"/>
+        </w:rPr>
         <w:t>4. Access System Services</w:t>
       </w:r>
     </w:p>
     <w:p>
       <w:pPr>
         <w:pStyle w:val="NormalWeb"/>
-      </w:pPr>
-      <w:r>
+        <w:rPr>
+          <w:sz w:val="28"/>
+          <w:szCs w:val="28"/>
+        </w:rPr>
+      </w:pPr>
+      <w:r>
+        <w:rPr>
+          <w:sz w:val="28"/>
+          <w:szCs w:val="28"/>
+        </w:rPr>
         <w:t>Once everything is up, the following services will be available:</w:t>
       </w:r>
     </w:p>
@@ -393,9 +795,9 @@
         <w:tblLook w:val="04A0" w:firstRow="1" w:lastRow="0" w:firstColumn="1" w:lastColumn="0" w:noHBand="0" w:noVBand="1"/>
       </w:tblPr>
       <w:tblGrid>
-        <w:gridCol w:w="891"/>
-        <w:gridCol w:w="2461"/>
-        <w:gridCol w:w="2950"/>
+        <w:gridCol w:w="1133"/>
+        <w:gridCol w:w="2969"/>
+        <w:gridCol w:w="3777"/>
       </w:tblGrid>
       <w:tr>
         <w:trPr>
@@ -412,16 +814,18 @@
             <w:pPr>
               <w:jc w:val="center"/>
               <w:rPr>
+                <w:rFonts w:ascii="Times New Roman" w:hAnsi="Times New Roman" w:cs="Times New Roman"/>
                 <w:b/>
                 <w:bCs/>
+                <w:sz w:val="28"/>
               </w:rPr>
             </w:pPr>
             <w:r>
               <w:rPr>
-                <w:b/>
-                <w:bCs/>
+                <w:rStyle w:val="Strong"/>
+                <w:rFonts w:ascii="Times New Roman" w:hAnsi="Times New Roman" w:cs="Times New Roman"/>
+                <w:sz w:val="28"/>
               </w:rPr>
-              <w:lastRenderedPageBreak/>
               <w:t>Service</w:t>
             </w:r>
           </w:p>
@@ -436,14 +840,17 @@
             <w:pPr>
               <w:jc w:val="center"/>
               <w:rPr>
+                <w:rFonts w:ascii="Times New Roman" w:hAnsi="Times New Roman" w:cs="Times New Roman"/>
                 <w:b/>
                 <w:bCs/>
+                <w:sz w:val="28"/>
               </w:rPr>
             </w:pPr>
             <w:r>
               <w:rPr>
-                <w:b/>
-                <w:bCs/>
+                <w:rStyle w:val="Strong"/>
+                <w:rFonts w:ascii="Times New Roman" w:hAnsi="Times New Roman" w:cs="Times New Roman"/>
+                <w:sz w:val="28"/>
               </w:rPr>
               <w:t>URL</w:t>
             </w:r>
@@ -459,14 +866,17 @@
             <w:pPr>
               <w:jc w:val="center"/>
               <w:rPr>
+                <w:rFonts w:ascii="Times New Roman" w:hAnsi="Times New Roman" w:cs="Times New Roman"/>
                 <w:b/>
                 <w:bCs/>
+                <w:sz w:val="28"/>
               </w:rPr>
             </w:pPr>
             <w:r>
               <w:rPr>
-                <w:b/>
-                <w:bCs/>
+                <w:rStyle w:val="Strong"/>
+                <w:rFonts w:ascii="Times New Roman" w:hAnsi="Times New Roman" w:cs="Times New Roman"/>
+                <w:sz w:val="28"/>
               </w:rPr>
               <w:t>Description</w:t>
             </w:r>
@@ -484,7 +894,17 @@
             <w:hideMark/>
           </w:tcPr>
           <w:p>
+            <w:pPr>
+              <w:rPr>
+                <w:rFonts w:ascii="Times New Roman" w:hAnsi="Times New Roman" w:cs="Times New Roman"/>
+                <w:sz w:val="28"/>
+              </w:rPr>
+            </w:pPr>
             <w:r>
+              <w:rPr>
+                <w:rFonts w:ascii="Times New Roman" w:hAnsi="Times New Roman" w:cs="Times New Roman"/>
+                <w:sz w:val="28"/>
+              </w:rPr>
               <w:t>Frontend</w:t>
             </w:r>
           </w:p>
@@ -496,10 +916,18 @@
             <w:hideMark/>
           </w:tcPr>
           <w:p>
+            <w:pPr>
+              <w:rPr>
+                <w:rFonts w:ascii="Times New Roman" w:hAnsi="Times New Roman" w:cs="Times New Roman"/>
+                <w:sz w:val="28"/>
+              </w:rPr>
+            </w:pPr>
             <w:hyperlink r:id="rId5" w:tgtFrame="_new" w:history="1">
               <w:r>
                 <w:rPr>
                   <w:rStyle w:val="Hyperlink"/>
+                  <w:rFonts w:ascii="Times New Roman" w:hAnsi="Times New Roman" w:cs="Times New Roman"/>
+                  <w:sz w:val="28"/>
                 </w:rPr>
                 <w:t>http://localhost:5173</w:t>
               </w:r>
@@ -513,7 +941,17 @@
             <w:hideMark/>
           </w:tcPr>
           <w:p>
+            <w:pPr>
+              <w:rPr>
+                <w:rFonts w:ascii="Times New Roman" w:hAnsi="Times New Roman" w:cs="Times New Roman"/>
+                <w:sz w:val="28"/>
+              </w:rPr>
+            </w:pPr>
             <w:r>
+              <w:rPr>
+                <w:rFonts w:ascii="Times New Roman" w:hAnsi="Times New Roman" w:cs="Times New Roman"/>
+                <w:sz w:val="28"/>
+              </w:rPr>
               <w:t>Web application interface</w:t>
             </w:r>
           </w:p>
@@ -530,7 +968,17 @@
             <w:hideMark/>
           </w:tcPr>
           <w:p>
+            <w:pPr>
+              <w:rPr>
+                <w:rFonts w:ascii="Times New Roman" w:hAnsi="Times New Roman" w:cs="Times New Roman"/>
+                <w:sz w:val="28"/>
+              </w:rPr>
+            </w:pPr>
             <w:r>
+              <w:rPr>
+                <w:rFonts w:ascii="Times New Roman" w:hAnsi="Times New Roman" w:cs="Times New Roman"/>
+                <w:sz w:val="28"/>
+              </w:rPr>
               <w:t>Backend</w:t>
             </w:r>
           </w:p>
@@ -542,10 +990,18 @@
             <w:hideMark/>
           </w:tcPr>
           <w:p>
+            <w:pPr>
+              <w:rPr>
+                <w:rFonts w:ascii="Times New Roman" w:hAnsi="Times New Roman" w:cs="Times New Roman"/>
+                <w:sz w:val="28"/>
+              </w:rPr>
+            </w:pPr>
             <w:hyperlink r:id="rId6" w:tgtFrame="_new" w:history="1">
               <w:r>
                 <w:rPr>
                   <w:rStyle w:val="Hyperlink"/>
+                  <w:rFonts w:ascii="Times New Roman" w:hAnsi="Times New Roman" w:cs="Times New Roman"/>
+                  <w:sz w:val="28"/>
                 </w:rPr>
                 <w:t>http://localhost:8000/docs</w:t>
               </w:r>
@@ -559,12 +1015,26 @@
             <w:hideMark/>
           </w:tcPr>
           <w:p>
+            <w:pPr>
+              <w:rPr>
+                <w:rFonts w:ascii="Times New Roman" w:hAnsi="Times New Roman" w:cs="Times New Roman"/>
+                <w:sz w:val="28"/>
+              </w:rPr>
+            </w:pPr>
             <w:proofErr w:type="spellStart"/>
             <w:r>
+              <w:rPr>
+                <w:rFonts w:ascii="Times New Roman" w:hAnsi="Times New Roman" w:cs="Times New Roman"/>
+                <w:sz w:val="28"/>
+              </w:rPr>
               <w:t>FastAPI</w:t>
             </w:r>
             <w:proofErr w:type="spellEnd"/>
             <w:r>
+              <w:rPr>
+                <w:rFonts w:ascii="Times New Roman" w:hAnsi="Times New Roman" w:cs="Times New Roman"/>
+                <w:sz w:val="28"/>
+              </w:rPr>
               <w:t xml:space="preserve"> Swagger documentation</w:t>
             </w:r>
           </w:p>
@@ -581,8 +1051,18 @@
             <w:hideMark/>
           </w:tcPr>
           <w:p>
+            <w:pPr>
+              <w:rPr>
+                <w:rFonts w:ascii="Times New Roman" w:hAnsi="Times New Roman" w:cs="Times New Roman"/>
+                <w:sz w:val="28"/>
+              </w:rPr>
+            </w:pPr>
             <w:proofErr w:type="spellStart"/>
             <w:r>
+              <w:rPr>
+                <w:rFonts w:ascii="Times New Roman" w:hAnsi="Times New Roman" w:cs="Times New Roman"/>
+                <w:sz w:val="28"/>
+              </w:rPr>
               <w:t>pgAdmin</w:t>
             </w:r>
             <w:proofErr w:type="spellEnd"/>
@@ -595,10 +1075,18 @@
             <w:hideMark/>
           </w:tcPr>
           <w:p>
+            <w:pPr>
+              <w:rPr>
+                <w:rFonts w:ascii="Times New Roman" w:hAnsi="Times New Roman" w:cs="Times New Roman"/>
+                <w:sz w:val="28"/>
+              </w:rPr>
+            </w:pPr>
             <w:hyperlink r:id="rId7" w:tgtFrame="_new" w:history="1">
               <w:r>
                 <w:rPr>
                   <w:rStyle w:val="Hyperlink"/>
+                  <w:rFonts w:ascii="Times New Roman" w:hAnsi="Times New Roman" w:cs="Times New Roman"/>
+                  <w:sz w:val="28"/>
                 </w:rPr>
                 <w:t>http://localhost:5050</w:t>
               </w:r>
@@ -612,7 +1100,17 @@
             <w:hideMark/>
           </w:tcPr>
           <w:p>
+            <w:pPr>
+              <w:rPr>
+                <w:rFonts w:ascii="Times New Roman" w:hAnsi="Times New Roman" w:cs="Times New Roman"/>
+                <w:sz w:val="28"/>
+              </w:rPr>
+            </w:pPr>
             <w:r>
+              <w:rPr>
+                <w:rFonts w:ascii="Times New Roman" w:hAnsi="Times New Roman" w:cs="Times New Roman"/>
+                <w:sz w:val="28"/>
+              </w:rPr>
               <w:t>PostgreSQL database manager</w:t>
             </w:r>
           </w:p>
@@ -620,21 +1118,52 @@
       </w:tr>
     </w:tbl>
     <w:p>
-      <w:r>
+      <w:pPr>
+        <w:rPr>
+          <w:rFonts w:ascii="Times New Roman" w:hAnsi="Times New Roman" w:cs="Times New Roman"/>
+          <w:sz w:val="28"/>
+        </w:rPr>
+      </w:pPr>
+      <w:r>
+        <w:rPr>
+          <w:rFonts w:ascii="Times New Roman" w:hAnsi="Times New Roman" w:cs="Times New Roman"/>
+          <w:sz w:val="28"/>
+        </w:rPr>
         <w:pict>
-          <v:rect id="_x0000_i1043" style="width:0;height:1.5pt" o:hralign="center" o:hrstd="t" o:hr="t" fillcolor="#a0a0a0" stroked="f"/>
+          <v:rect id="_x0000_i1045" style="width:0;height:1.5pt" o:hralign="center" o:hrstd="t" o:hr="t" fillcolor="#a0a0a0" stroked="f"/>
         </w:pict>
       </w:r>
     </w:p>
     <w:p>
       <w:pPr>
-        <w:pStyle w:val="Heading4"/>
-      </w:pPr>
-      <w:r>
+        <w:pStyle w:val="Heading3"/>
+        <w:rPr>
+          <w:rFonts w:ascii="Times New Roman" w:hAnsi="Times New Roman" w:cs="Times New Roman"/>
+          <w:sz w:val="28"/>
+          <w:szCs w:val="28"/>
+        </w:rPr>
+      </w:pPr>
+      <w:r>
+        <w:rPr>
+          <w:rStyle w:val="Strong"/>
+          <w:rFonts w:ascii="Times New Roman" w:hAnsi="Times New Roman" w:cs="Times New Roman"/>
+          <w:b w:val="0"/>
+          <w:bCs w:val="0"/>
+          <w:sz w:val="28"/>
+          <w:szCs w:val="28"/>
+        </w:rPr>
         <w:t xml:space="preserve">5. Log in to </w:t>
       </w:r>
       <w:proofErr w:type="spellStart"/>
       <w:r>
+        <w:rPr>
+          <w:rStyle w:val="Strong"/>
+          <w:rFonts w:ascii="Times New Roman" w:hAnsi="Times New Roman" w:cs="Times New Roman"/>
+          <w:b w:val="0"/>
+          <w:bCs w:val="0"/>
+          <w:sz w:val="28"/>
+          <w:szCs w:val="28"/>
+        </w:rPr>
         <w:t>pgAdmin</w:t>
       </w:r>
       <w:proofErr w:type="spellEnd"/>
@@ -644,496 +1173,57 @@
         <w:pStyle w:val="NormalWeb"/>
         <w:numPr>
           <w:ilvl w:val="0"/>
-          <w:numId w:val="5"/>
+          <w:numId w:val="10"/>
         </w:numPr>
-      </w:pPr>
-      <w:r>
+        <w:rPr>
+          <w:sz w:val="28"/>
+          <w:szCs w:val="28"/>
+        </w:rPr>
+      </w:pPr>
+      <w:r>
+        <w:rPr>
+          <w:sz w:val="28"/>
+          <w:szCs w:val="28"/>
+        </w:rPr>
         <w:t xml:space="preserve">Open </w:t>
-      </w:r>
-      <w:r>
-        <w:rPr>
-          <w:rStyle w:val="HTMLCode"/>
-        </w:rPr>
-        <w:t>http://localhost:5050</w:t>
-      </w:r>
-      <w:r>
-        <w:t xml:space="preserve"> in a browser.</w:t>
-      </w:r>
-    </w:p>
-    <w:p>
-      <w:pPr>
-        <w:pStyle w:val="NormalWeb"/>
-        <w:numPr>
-          <w:ilvl w:val="0"/>
-          <w:numId w:val="5"/>
-        </w:numPr>
-      </w:pPr>
-      <w:r>
-        <w:t>Use the following login credentials:</w:t>
-      </w:r>
-    </w:p>
-    <w:p>
-      <w:pPr>
-        <w:pStyle w:val="NormalWeb"/>
-        <w:numPr>
-          <w:ilvl w:val="1"/>
-          <w:numId w:val="5"/>
-        </w:numPr>
-      </w:pPr>
-      <w:r>
-        <w:rPr>
-          <w:rStyle w:val="Strong"/>
-        </w:rPr>
-        <w:t>Email</w:t>
-      </w:r>
-      <w:r>
-        <w:t xml:space="preserve">: </w:t>
-      </w:r>
-      <w:r>
-        <w:rPr>
-          <w:rStyle w:val="HTMLCode"/>
-        </w:rPr>
-        <w:t>admin@example.com</w:t>
-      </w:r>
-    </w:p>
-    <w:p>
-      <w:pPr>
-        <w:pStyle w:val="NormalWeb"/>
-        <w:numPr>
-          <w:ilvl w:val="1"/>
-          <w:numId w:val="5"/>
-        </w:numPr>
-      </w:pPr>
-      <w:r>
-        <w:rPr>
-          <w:rStyle w:val="Strong"/>
-        </w:rPr>
-        <w:t>Password</w:t>
-      </w:r>
-      <w:r>
-        <w:t xml:space="preserve">: </w:t>
-      </w:r>
-      <w:r>
-        <w:rPr>
-          <w:rStyle w:val="HTMLCode"/>
-        </w:rPr>
-        <w:t>admin123</w:t>
-      </w:r>
-    </w:p>
-    <w:p>
-      <w:r>
-        <w:pict>
-          <v:rect id="_x0000_i1044" style="width:0;height:1.5pt" o:hralign="center" o:hrstd="t" o:hr="t" fillcolor="#a0a0a0" stroked="f"/>
-        </w:pict>
-      </w:r>
-    </w:p>
-    <w:p>
-      <w:pPr>
-        <w:pStyle w:val="Heading4"/>
-      </w:pPr>
-      <w:r>
-        <w:t xml:space="preserve">6. Add PostgreSQL Server in </w:t>
-      </w:r>
-      <w:proofErr w:type="spellStart"/>
-      <w:r>
-        <w:t>pgAdmin</w:t>
-      </w:r>
-      <w:proofErr w:type="spellEnd"/>
-    </w:p>
-    <w:p>
-      <w:pPr>
-        <w:pStyle w:val="NormalWeb"/>
-      </w:pPr>
-      <w:r>
-        <w:t>After logging in:</w:t>
-      </w:r>
-    </w:p>
-    <w:p>
-      <w:pPr>
-        <w:pStyle w:val="NormalWeb"/>
-        <w:numPr>
-          <w:ilvl w:val="0"/>
-          <w:numId w:val="6"/>
-        </w:numPr>
-      </w:pPr>
-      <w:r>
-        <w:t xml:space="preserve">Click </w:t>
-      </w:r>
-      <w:r>
-        <w:rPr>
-          <w:rStyle w:val="Strong"/>
-        </w:rPr>
-        <w:t>"Add New Server"</w:t>
-      </w:r>
-      <w:r>
-        <w:t>.</w:t>
-      </w:r>
-    </w:p>
-    <w:p>
-      <w:pPr>
-        <w:pStyle w:val="NormalWeb"/>
-        <w:numPr>
-          <w:ilvl w:val="0"/>
-          <w:numId w:val="6"/>
-        </w:numPr>
-      </w:pPr>
-      <w:r>
-        <w:t xml:space="preserve">Under the </w:t>
-      </w:r>
-      <w:r>
-        <w:rPr>
-          <w:rStyle w:val="Strong"/>
-        </w:rPr>
-        <w:t>General</w:t>
-      </w:r>
-      <w:r>
-        <w:t xml:space="preserve"> tab:</w:t>
-      </w:r>
-    </w:p>
-    <w:p>
-      <w:pPr>
-        <w:pStyle w:val="NormalWeb"/>
-        <w:numPr>
-          <w:ilvl w:val="1"/>
-          <w:numId w:val="6"/>
-        </w:numPr>
-      </w:pPr>
-      <w:r>
-        <w:rPr>
-          <w:rStyle w:val="Strong"/>
-        </w:rPr>
-        <w:t>Name</w:t>
-      </w:r>
-      <w:r>
-        <w:t xml:space="preserve">: </w:t>
-      </w:r>
-      <w:proofErr w:type="spellStart"/>
-      <w:r>
-        <w:rPr>
-          <w:rStyle w:val="HTMLCode"/>
-        </w:rPr>
-        <w:t>docker-postgres</w:t>
-      </w:r>
-      <w:proofErr w:type="spellEnd"/>
-    </w:p>
-    <w:p>
-      <w:pPr>
-        <w:pStyle w:val="NormalWeb"/>
-        <w:numPr>
-          <w:ilvl w:val="0"/>
-          <w:numId w:val="6"/>
-        </w:numPr>
-      </w:pPr>
-      <w:r>
-        <w:t xml:space="preserve">Under the </w:t>
-      </w:r>
-      <w:r>
-        <w:rPr>
-          <w:rStyle w:val="Strong"/>
-        </w:rPr>
-        <w:t>Connection</w:t>
-      </w:r>
-      <w:r>
-        <w:t xml:space="preserve"> tab:</w:t>
-      </w:r>
-    </w:p>
-    <w:p>
-      <w:pPr>
-        <w:pStyle w:val="NormalWeb"/>
-        <w:numPr>
-          <w:ilvl w:val="1"/>
-          <w:numId w:val="6"/>
-        </w:numPr>
-      </w:pPr>
-      <w:r>
-        <w:rPr>
-          <w:rStyle w:val="Strong"/>
-        </w:rPr>
-        <w:t>Host name/address</w:t>
-      </w:r>
-      <w:r>
-        <w:t xml:space="preserve">: </w:t>
-      </w:r>
-      <w:proofErr w:type="spellStart"/>
-      <w:r>
-        <w:rPr>
-          <w:rStyle w:val="HTMLCode"/>
-        </w:rPr>
-        <w:t>db</w:t>
-      </w:r>
-      <w:proofErr w:type="spellEnd"/>
-    </w:p>
-    <w:p>
-      <w:pPr>
-        <w:pStyle w:val="NormalWeb"/>
-        <w:numPr>
-          <w:ilvl w:val="1"/>
-          <w:numId w:val="6"/>
-        </w:numPr>
-      </w:pPr>
-      <w:r>
-        <w:rPr>
-          <w:rStyle w:val="Strong"/>
-        </w:rPr>
-        <w:t>Port</w:t>
-      </w:r>
-      <w:r>
-        <w:t xml:space="preserve">: </w:t>
-      </w:r>
-      <w:r>
-        <w:rPr>
-          <w:rStyle w:val="HTMLCode"/>
-        </w:rPr>
-        <w:t>5432</w:t>
-      </w:r>
-    </w:p>
-    <w:p>
-      <w:pPr>
-        <w:pStyle w:val="NormalWeb"/>
-        <w:numPr>
-          <w:ilvl w:val="1"/>
-          <w:numId w:val="6"/>
-        </w:numPr>
-      </w:pPr>
-      <w:r>
-        <w:rPr>
-          <w:rStyle w:val="Strong"/>
-        </w:rPr>
-        <w:t>Username</w:t>
-      </w:r>
-      <w:r>
-        <w:t xml:space="preserve">: </w:t>
-      </w:r>
-      <w:proofErr w:type="spellStart"/>
-      <w:r>
-        <w:rPr>
-          <w:rStyle w:val="HTMLCode"/>
-        </w:rPr>
-        <w:t>postgres</w:t>
-      </w:r>
-      <w:proofErr w:type="spellEnd"/>
-    </w:p>
-    <w:p>
-      <w:pPr>
-        <w:pStyle w:val="NormalWeb"/>
-        <w:numPr>
-          <w:ilvl w:val="1"/>
-          <w:numId w:val="6"/>
-        </w:numPr>
-      </w:pPr>
-      <w:r>
-        <w:rPr>
-          <w:rStyle w:val="Strong"/>
-        </w:rPr>
-        <w:t>Password</w:t>
-      </w:r>
-      <w:r>
-        <w:t xml:space="preserve">: </w:t>
-      </w:r>
-      <w:proofErr w:type="spellStart"/>
-      <w:r>
-        <w:rPr>
-          <w:rStyle w:val="HTMLCode"/>
-        </w:rPr>
-        <w:t>postgres</w:t>
-      </w:r>
-      <w:proofErr w:type="spellEnd"/>
-    </w:p>
-    <w:p>
-      <w:pPr>
-        <w:pStyle w:val="NormalWeb"/>
-        <w:numPr>
-          <w:ilvl w:val="1"/>
-          <w:numId w:val="6"/>
-        </w:numPr>
-      </w:pPr>
-      <w:r>
-        <w:t xml:space="preserve">Enable </w:t>
-      </w:r>
-      <w:r>
-        <w:rPr>
-          <w:rStyle w:val="Strong"/>
-        </w:rPr>
-        <w:t>Save Password</w:t>
-      </w:r>
-    </w:p>
-    <w:p>
-      <w:pPr>
-        <w:pStyle w:val="NormalWeb"/>
-        <w:numPr>
-          <w:ilvl w:val="0"/>
-          <w:numId w:val="6"/>
-        </w:numPr>
-      </w:pPr>
-      <w:r>
-        <w:t xml:space="preserve">Click </w:t>
-      </w:r>
-      <w:r>
-        <w:rPr>
-          <w:rStyle w:val="Strong"/>
-        </w:rPr>
-        <w:t>Save</w:t>
-      </w:r>
-      <w:r>
-        <w:t>.</w:t>
-      </w:r>
-    </w:p>
-    <w:p>
-      <w:pPr>
-        <w:pStyle w:val="NormalWeb"/>
-      </w:pPr>
-      <w:r>
-        <w:t xml:space="preserve">You will now have access to the database named </w:t>
-      </w:r>
-      <w:proofErr w:type="spellStart"/>
-      <w:r>
-        <w:rPr>
-          <w:rStyle w:val="HTMLCode"/>
-        </w:rPr>
-        <w:t>fastapi_db</w:t>
-      </w:r>
-      <w:proofErr w:type="spellEnd"/>
-      <w:r>
-        <w:t>.</w:t>
-      </w:r>
-    </w:p>
-    <w:p>
-      <w:r>
-        <w:pict>
-          <v:rect id="_x0000_i1045" style="width:0;height:1.5pt" o:hralign="center" o:hrstd="t" o:hr="t" fillcolor="#a0a0a0" stroked="f"/>
-        </w:pict>
-      </w:r>
-    </w:p>
-    <w:p>
-      <w:pPr>
-        <w:pStyle w:val="Heading4"/>
-      </w:pPr>
-      <w:r>
-        <w:t>7. Verify Database Tables</w:t>
-      </w:r>
-    </w:p>
-    <w:p>
-      <w:pPr>
-        <w:pStyle w:val="NormalWeb"/>
-      </w:pPr>
-      <w:r>
-        <w:t xml:space="preserve">After running the Alembic migration, the </w:t>
-      </w:r>
-      <w:proofErr w:type="spellStart"/>
-      <w:r>
-        <w:rPr>
-          <w:rStyle w:val="HTMLCode"/>
-        </w:rPr>
-        <w:t>fastapi_db</w:t>
-      </w:r>
-      <w:proofErr w:type="spellEnd"/>
-      <w:r>
-        <w:t xml:space="preserve"> database should contain the required tables. These can be viewed in </w:t>
-      </w:r>
-      <w:proofErr w:type="spellStart"/>
-      <w:r>
-        <w:t>pgAdmin</w:t>
-      </w:r>
-      <w:proofErr w:type="spellEnd"/>
-      <w:r>
-        <w:t xml:space="preserve"> under the server </w:t>
-      </w:r>
-      <w:proofErr w:type="spellStart"/>
-      <w:r>
-        <w:rPr>
-          <w:rStyle w:val="HTMLCode"/>
-        </w:rPr>
-        <w:t>docker-postgres</w:t>
-      </w:r>
-      <w:proofErr w:type="spellEnd"/>
-      <w:r>
-        <w:t>.</w:t>
-      </w:r>
-    </w:p>
-    <w:p>
-      <w:r>
-        <w:pict>
-          <v:rect id="_x0000_i1046" style="width:0;height:1.5pt" o:hralign="center" o:hrstd="t" o:hr="t" fillcolor="#a0a0a0" stroked="f"/>
-        </w:pict>
-      </w:r>
-    </w:p>
-    <w:p>
-      <w:pPr>
-        <w:pStyle w:val="Heading4"/>
-      </w:pPr>
-      <w:r>
-        <w:rPr>
-          <w:rFonts w:ascii="Segoe UI Symbol" w:hAnsi="Segoe UI Symbol" w:cs="Segoe UI Symbol"/>
-        </w:rPr>
-        <w:lastRenderedPageBreak/>
-        <w:t>🔐</w:t>
-      </w:r>
-      <w:r>
-        <w:t xml:space="preserve"> 8. Create a New Admin User via Swagger (If Locked Out)</w:t>
-      </w:r>
-    </w:p>
-    <w:p>
-      <w:pPr>
-        <w:pStyle w:val="NormalWeb"/>
-      </w:pPr>
-      <w:r>
-        <w:t xml:space="preserve">If you're unable to log in via the frontend (e.g., due to a forgotten password for </w:t>
-      </w:r>
-      <w:r>
-        <w:rPr>
-          <w:rStyle w:val="HTMLCode"/>
-        </w:rPr>
-        <w:t>admin@yourdomain.com</w:t>
-      </w:r>
-      <w:r>
-        <w:t xml:space="preserve"> and no other users exist), follow these steps:</w:t>
-      </w:r>
-    </w:p>
-    <w:p>
-      <w:pPr>
-        <w:pStyle w:val="NormalWeb"/>
-        <w:numPr>
-          <w:ilvl w:val="0"/>
-          <w:numId w:val="7"/>
-        </w:numPr>
-      </w:pPr>
-      <w:r>
-        <w:t>Open the Swagger UI at:</w:t>
-      </w:r>
-      <w:r>
-        <w:br/>
-      </w:r>
-      <w:r>
-        <w:rPr>
-          <w:rFonts w:ascii="Segoe UI Symbol" w:hAnsi="Segoe UI Symbol" w:cs="Segoe UI Symbol"/>
-        </w:rPr>
-        <w:t>👉</w:t>
-      </w:r>
-      <w:r>
-        <w:t xml:space="preserve"> </w:t>
       </w:r>
       <w:hyperlink r:id="rId8" w:tgtFrame="_new" w:history="1">
         <w:r>
           <w:rPr>
             <w:rStyle w:val="Hyperlink"/>
             <w:rFonts w:eastAsiaTheme="majorEastAsia"/>
-            <w:b/>
-            <w:bCs/>
+            <w:sz w:val="28"/>
+            <w:szCs w:val="28"/>
           </w:rPr>
-          <w:t>http://localhost:8000/docs</w:t>
+          <w:t>http://localhost:5050</w:t>
         </w:r>
       </w:hyperlink>
+      <w:r>
+        <w:rPr>
+          <w:sz w:val="28"/>
+          <w:szCs w:val="28"/>
+        </w:rPr>
+        <w:t xml:space="preserve"> in a browser.</w:t>
+      </w:r>
     </w:p>
     <w:p>
       <w:pPr>
         <w:pStyle w:val="NormalWeb"/>
         <w:numPr>
           <w:ilvl w:val="0"/>
-          <w:numId w:val="7"/>
+          <w:numId w:val="10"/>
         </w:numPr>
-      </w:pPr>
-      <w:r>
-        <w:t>Look for the endpoint:</w:t>
+        <w:rPr>
+          <w:sz w:val="28"/>
+          <w:szCs w:val="28"/>
+        </w:rPr>
+      </w:pPr>
+      <w:r>
+        <w:rPr>
+          <w:sz w:val="28"/>
+          <w:szCs w:val="28"/>
+        </w:rPr>
+        <w:t>Use the following login credentials:</w:t>
       </w:r>
     </w:p>
     <w:p>
@@ -1141,26 +1231,124 @@
         <w:pStyle w:val="NormalWeb"/>
         <w:numPr>
           <w:ilvl w:val="1"/>
-          <w:numId w:val="7"/>
+          <w:numId w:val="10"/>
         </w:numPr>
-      </w:pPr>
+        <w:rPr>
+          <w:sz w:val="28"/>
+          <w:szCs w:val="28"/>
+        </w:rPr>
+      </w:pPr>
+      <w:r>
+        <w:rPr>
+          <w:sz w:val="28"/>
+          <w:szCs w:val="28"/>
+        </w:rPr>
+        <w:t xml:space="preserve">Email: </w:t>
+      </w:r>
       <w:r>
         <w:rPr>
           <w:rStyle w:val="HTMLCode"/>
-        </w:rPr>
-        <w:t>POST /users/</w:t>
-      </w:r>
-      <w:r>
-        <w:t xml:space="preserve"> or similar (usually under </w:t>
-      </w:r>
+          <w:rFonts w:ascii="Times New Roman" w:hAnsi="Times New Roman" w:cs="Times New Roman"/>
+          <w:sz w:val="28"/>
+          <w:szCs w:val="28"/>
+        </w:rPr>
+        <w:t>admin@example.com</w:t>
+      </w:r>
+    </w:p>
+    <w:p>
+      <w:pPr>
+        <w:pStyle w:val="NormalWeb"/>
+        <w:numPr>
+          <w:ilvl w:val="1"/>
+          <w:numId w:val="10"/>
+        </w:numPr>
+        <w:rPr>
+          <w:sz w:val="28"/>
+          <w:szCs w:val="28"/>
+        </w:rPr>
+      </w:pPr>
+      <w:r>
+        <w:rPr>
+          <w:sz w:val="28"/>
+          <w:szCs w:val="28"/>
+        </w:rPr>
+        <w:t xml:space="preserve">Password: </w:t>
+      </w:r>
+      <w:r>
+        <w:rPr>
+          <w:rStyle w:val="HTMLCode"/>
+          <w:rFonts w:ascii="Times New Roman" w:hAnsi="Times New Roman" w:cs="Times New Roman"/>
+          <w:sz w:val="28"/>
+          <w:szCs w:val="28"/>
+        </w:rPr>
+        <w:t>admin123</w:t>
+      </w:r>
+    </w:p>
+    <w:p>
+      <w:pPr>
+        <w:rPr>
+          <w:rFonts w:ascii="Times New Roman" w:hAnsi="Times New Roman" w:cs="Times New Roman"/>
+          <w:sz w:val="28"/>
+        </w:rPr>
+      </w:pPr>
+      <w:r>
+        <w:rPr>
+          <w:rFonts w:ascii="Times New Roman" w:hAnsi="Times New Roman" w:cs="Times New Roman"/>
+          <w:sz w:val="28"/>
+        </w:rPr>
+        <w:pict>
+          <v:rect id="_x0000_i1046" style="width:0;height:1.5pt" o:hralign="center" o:hrstd="t" o:hr="t" fillcolor="#a0a0a0" stroked="f"/>
+        </w:pict>
+      </w:r>
+    </w:p>
+    <w:p>
+      <w:pPr>
+        <w:pStyle w:val="Heading3"/>
+        <w:rPr>
+          <w:rFonts w:ascii="Times New Roman" w:hAnsi="Times New Roman" w:cs="Times New Roman"/>
+          <w:sz w:val="28"/>
+          <w:szCs w:val="28"/>
+        </w:rPr>
+      </w:pPr>
       <w:r>
         <w:rPr>
           <w:rStyle w:val="Strong"/>
-        </w:rPr>
-        <w:t>Users</w:t>
-      </w:r>
-      <w:r>
-        <w:t xml:space="preserve"> section)</w:t>
+          <w:rFonts w:ascii="Times New Roman" w:hAnsi="Times New Roman" w:cs="Times New Roman"/>
+          <w:b w:val="0"/>
+          <w:bCs w:val="0"/>
+          <w:sz w:val="28"/>
+          <w:szCs w:val="28"/>
+        </w:rPr>
+        <w:t xml:space="preserve">6. Add PostgreSQL Server in </w:t>
+      </w:r>
+      <w:proofErr w:type="spellStart"/>
+      <w:r>
+        <w:rPr>
+          <w:rStyle w:val="Strong"/>
+          <w:rFonts w:ascii="Times New Roman" w:hAnsi="Times New Roman" w:cs="Times New Roman"/>
+          <w:b w:val="0"/>
+          <w:bCs w:val="0"/>
+          <w:sz w:val="28"/>
+          <w:szCs w:val="28"/>
+        </w:rPr>
+        <w:t>pgAdmin</w:t>
+      </w:r>
+      <w:proofErr w:type="spellEnd"/>
+    </w:p>
+    <w:p>
+      <w:pPr>
+        <w:pStyle w:val="NormalWeb"/>
+        <w:rPr>
+          <w:sz w:val="28"/>
+          <w:szCs w:val="28"/>
+        </w:rPr>
+      </w:pPr>
+      <w:r>
+        <w:rPr>
+          <w:sz w:val="28"/>
+          <w:szCs w:val="28"/>
+        </w:rPr>
+        <w:t>After logging in:</w:t>
       </w:r>
     </w:p>
     <w:p>
@@ -1168,234 +1356,34 @@
         <w:pStyle w:val="NormalWeb"/>
         <w:numPr>
           <w:ilvl w:val="0"/>
-          <w:numId w:val="7"/>
+          <w:numId w:val="11"/>
         </w:numPr>
-      </w:pPr>
-      <w:r>
+        <w:rPr>
+          <w:sz w:val="28"/>
+          <w:szCs w:val="28"/>
+        </w:rPr>
+      </w:pPr>
+      <w:r>
+        <w:rPr>
+          <w:sz w:val="28"/>
+          <w:szCs w:val="28"/>
+        </w:rPr>
         <w:t xml:space="preserve">Click </w:t>
       </w:r>
       <w:r>
         <w:rPr>
           <w:rStyle w:val="Strong"/>
-        </w:rPr>
-        <w:t>Try it out</w:t>
-      </w:r>
-      <w:r>
-        <w:t>, then enter the user details in JSON format:</w:t>
-      </w:r>
-    </w:p>
-    <w:p>
-      <w:pPr>
-        <w:pStyle w:val="HTMLPreformatted"/>
-        <w:rPr>
-          <w:rStyle w:val="HTMLCode"/>
-        </w:rPr>
-      </w:pPr>
-      <w:r>
-        <w:rPr>
-          <w:rStyle w:val="hljs-punctuation"/>
-        </w:rPr>
-        <w:t>{</w:t>
-      </w:r>
-    </w:p>
-    <w:p>
-      <w:pPr>
-        <w:pStyle w:val="HTMLPreformatted"/>
-        <w:rPr>
-          <w:rStyle w:val="HTMLCode"/>
-        </w:rPr>
-      </w:pPr>
-      <w:r>
-        <w:rPr>
-          <w:rStyle w:val="HTMLCode"/>
-        </w:rPr>
-        <w:t xml:space="preserve">  </w:t>
-      </w:r>
-      <w:r>
-        <w:rPr>
-          <w:rStyle w:val="hljs-attr"/>
-        </w:rPr>
-        <w:t>"email"</w:t>
-      </w:r>
-      <w:r>
-        <w:rPr>
-          <w:rStyle w:val="hljs-punctuation"/>
-        </w:rPr>
-        <w:t>:</w:t>
-      </w:r>
-      <w:r>
-        <w:rPr>
-          <w:rStyle w:val="HTMLCode"/>
-        </w:rPr>
-        <w:t xml:space="preserve"> </w:t>
-      </w:r>
-      <w:r>
-        <w:rPr>
-          <w:rStyle w:val="hljs-string"/>
-        </w:rPr>
-        <w:t>"newadmin@example.com"</w:t>
-      </w:r>
-      <w:r>
-        <w:rPr>
-          <w:rStyle w:val="hljs-punctuation"/>
-        </w:rPr>
-        <w:t>,</w:t>
-      </w:r>
-    </w:p>
-    <w:p>
-      <w:pPr>
-        <w:pStyle w:val="HTMLPreformatted"/>
-        <w:rPr>
-          <w:rStyle w:val="HTMLCode"/>
-        </w:rPr>
-      </w:pPr>
-      <w:r>
-        <w:rPr>
-          <w:rStyle w:val="HTMLCode"/>
-        </w:rPr>
-        <w:t xml:space="preserve">  </w:t>
-      </w:r>
-      <w:r>
-        <w:rPr>
-          <w:rStyle w:val="hljs-attr"/>
-        </w:rPr>
-        <w:t>"password"</w:t>
-      </w:r>
-      <w:r>
-        <w:rPr>
-          <w:rStyle w:val="hljs-punctuation"/>
-        </w:rPr>
-        <w:t>:</w:t>
-      </w:r>
-      <w:r>
-        <w:rPr>
-          <w:rStyle w:val="HTMLCode"/>
-        </w:rPr>
-        <w:t xml:space="preserve"> </w:t>
-      </w:r>
-      <w:r>
-        <w:rPr>
-          <w:rStyle w:val="hljs-string"/>
-        </w:rPr>
-        <w:t>"</w:t>
-      </w:r>
-      <w:proofErr w:type="spellStart"/>
-      <w:r>
-        <w:rPr>
-          <w:rStyle w:val="hljs-string"/>
-        </w:rPr>
-        <w:t>yoursecurepassword</w:t>
-      </w:r>
-      <w:proofErr w:type="spellEnd"/>
-      <w:r>
-        <w:rPr>
-          <w:rStyle w:val="hljs-string"/>
-        </w:rPr>
-        <w:t>"</w:t>
-      </w:r>
-      <w:r>
-        <w:rPr>
-          <w:rStyle w:val="hljs-punctuation"/>
-        </w:rPr>
-        <w:t>,</w:t>
-      </w:r>
-    </w:p>
-    <w:p>
-      <w:pPr>
-        <w:pStyle w:val="HTMLPreformatted"/>
-        <w:rPr>
-          <w:rStyle w:val="HTMLCode"/>
-        </w:rPr>
-      </w:pPr>
-      <w:r>
-        <w:rPr>
-          <w:rStyle w:val="HTMLCode"/>
-        </w:rPr>
-        <w:t xml:space="preserve">  </w:t>
-      </w:r>
-      <w:r>
-        <w:rPr>
-          <w:rStyle w:val="hljs-attr"/>
-        </w:rPr>
-        <w:t>"</w:t>
-      </w:r>
-      <w:proofErr w:type="spellStart"/>
-      <w:r>
-        <w:rPr>
-          <w:rStyle w:val="hljs-attr"/>
-        </w:rPr>
-        <w:t>full_name</w:t>
-      </w:r>
-      <w:proofErr w:type="spellEnd"/>
-      <w:r>
-        <w:rPr>
-          <w:rStyle w:val="hljs-attr"/>
-        </w:rPr>
-        <w:t>"</w:t>
-      </w:r>
-      <w:r>
-        <w:rPr>
-          <w:rStyle w:val="hljs-punctuation"/>
-        </w:rPr>
-        <w:t>:</w:t>
-      </w:r>
-      <w:r>
-        <w:rPr>
-          <w:rStyle w:val="HTMLCode"/>
-        </w:rPr>
-        <w:t xml:space="preserve"> </w:t>
-      </w:r>
-      <w:r>
-        <w:rPr>
-          <w:rStyle w:val="hljs-string"/>
-        </w:rPr>
-        <w:t>"New Admin"</w:t>
-      </w:r>
-      <w:r>
-        <w:rPr>
-          <w:rStyle w:val="hljs-punctuation"/>
-        </w:rPr>
-        <w:t>,</w:t>
-      </w:r>
-    </w:p>
-    <w:p>
-      <w:pPr>
-        <w:pStyle w:val="HTMLPreformatted"/>
-        <w:rPr>
-          <w:rStyle w:val="HTMLCode"/>
-        </w:rPr>
-      </w:pPr>
-      <w:r>
-        <w:rPr>
-          <w:rStyle w:val="HTMLCode"/>
-        </w:rPr>
-        <w:t xml:space="preserve">  </w:t>
-      </w:r>
-      <w:r>
-        <w:rPr>
-          <w:rStyle w:val="HTMLCode"/>
-        </w:rPr>
-        <w:t>“</w:t>
-      </w:r>
-      <w:r>
-        <w:rPr>
-          <w:rStyle w:val="hljs-attr"/>
-        </w:rPr>
-        <w:t>(admin)”</w:t>
-      </w:r>
-    </w:p>
-    <w:p>
-      <w:pPr>
-        <w:pStyle w:val="HTMLPreformatted"/>
-        <w:rPr>
-          <w:rStyle w:val="HTMLCode"/>
-        </w:rPr>
-      </w:pPr>
-      <w:r>
-        <w:rPr>
-          <w:rStyle w:val="hljs-punctuation"/>
-        </w:rPr>
-        <w:t>}</w:t>
+          <w:sz w:val="28"/>
+          <w:szCs w:val="28"/>
+        </w:rPr>
+        <w:t>"Add New Server"</w:t>
+      </w:r>
+      <w:r>
+        <w:rPr>
+          <w:sz w:val="28"/>
+          <w:szCs w:val="28"/>
+        </w:rPr>
+        <w:t>.</w:t>
       </w:r>
     </w:p>
     <w:p>
@@ -1403,43 +1391,537 @@
         <w:pStyle w:val="NormalWeb"/>
         <w:numPr>
           <w:ilvl w:val="0"/>
-          <w:numId w:val="8"/>
+          <w:numId w:val="11"/>
         </w:numPr>
-      </w:pPr>
-      <w:r>
-        <w:t xml:space="preserve">Click </w:t>
+        <w:rPr>
+          <w:sz w:val="28"/>
+          <w:szCs w:val="28"/>
+        </w:rPr>
+      </w:pPr>
+      <w:r>
+        <w:rPr>
+          <w:sz w:val="28"/>
+          <w:szCs w:val="28"/>
+        </w:rPr>
+        <w:t xml:space="preserve">Under the </w:t>
       </w:r>
       <w:r>
         <w:rPr>
           <w:rStyle w:val="Strong"/>
-        </w:rPr>
-        <w:t>Execute</w:t>
-      </w:r>
-      <w:r>
-        <w:t>. If successful, this will create a new admin account.</w:t>
-      </w:r>
+          <w:sz w:val="28"/>
+          <w:szCs w:val="28"/>
+        </w:rPr>
+        <w:t>General tab</w:t>
+      </w:r>
+      <w:r>
+        <w:rPr>
+          <w:sz w:val="28"/>
+          <w:szCs w:val="28"/>
+        </w:rPr>
+        <w:t>:</w:t>
+      </w:r>
+    </w:p>
+    <w:p>
+      <w:pPr>
+        <w:pStyle w:val="NormalWeb"/>
+        <w:numPr>
+          <w:ilvl w:val="1"/>
+          <w:numId w:val="11"/>
+        </w:numPr>
+        <w:rPr>
+          <w:sz w:val="28"/>
+          <w:szCs w:val="28"/>
+        </w:rPr>
+      </w:pPr>
+      <w:r>
+        <w:rPr>
+          <w:sz w:val="28"/>
+          <w:szCs w:val="28"/>
+        </w:rPr>
+        <w:t xml:space="preserve">Name: </w:t>
+      </w:r>
+      <w:proofErr w:type="spellStart"/>
+      <w:r>
+        <w:rPr>
+          <w:rStyle w:val="HTMLCode"/>
+          <w:rFonts w:ascii="Times New Roman" w:hAnsi="Times New Roman" w:cs="Times New Roman"/>
+          <w:sz w:val="28"/>
+          <w:szCs w:val="28"/>
+        </w:rPr>
+        <w:t>docker-postgres</w:t>
+      </w:r>
+      <w:proofErr w:type="spellEnd"/>
     </w:p>
     <w:p>
       <w:pPr>
         <w:pStyle w:val="NormalWeb"/>
         <w:numPr>
           <w:ilvl w:val="0"/>
-          <w:numId w:val="8"/>
+          <w:numId w:val="11"/>
         </w:numPr>
-      </w:pPr>
-      <w:r>
-        <w:t>Use the new credentials to log in to the frontend at:</w:t>
-      </w:r>
-      <w:r>
+        <w:rPr>
+          <w:sz w:val="28"/>
+          <w:szCs w:val="28"/>
+        </w:rPr>
+      </w:pPr>
+      <w:r>
+        <w:rPr>
+          <w:sz w:val="28"/>
+          <w:szCs w:val="28"/>
+        </w:rPr>
+        <w:t xml:space="preserve">Under the </w:t>
+      </w:r>
+      <w:r>
+        <w:rPr>
+          <w:rStyle w:val="Strong"/>
+          <w:sz w:val="28"/>
+          <w:szCs w:val="28"/>
+        </w:rPr>
+        <w:t>Connection tab</w:t>
+      </w:r>
+      <w:r>
+        <w:rPr>
+          <w:sz w:val="28"/>
+          <w:szCs w:val="28"/>
+        </w:rPr>
+        <w:t>:</w:t>
+      </w:r>
+    </w:p>
+    <w:p>
+      <w:pPr>
+        <w:pStyle w:val="NormalWeb"/>
+        <w:numPr>
+          <w:ilvl w:val="1"/>
+          <w:numId w:val="11"/>
+        </w:numPr>
+        <w:rPr>
+          <w:sz w:val="28"/>
+          <w:szCs w:val="28"/>
+        </w:rPr>
+      </w:pPr>
+      <w:r>
+        <w:rPr>
+          <w:sz w:val="28"/>
+          <w:szCs w:val="28"/>
+        </w:rPr>
+        <w:t xml:space="preserve">Host name/address: </w:t>
+      </w:r>
+      <w:proofErr w:type="spellStart"/>
+      <w:r>
+        <w:rPr>
+          <w:rStyle w:val="HTMLCode"/>
+          <w:rFonts w:ascii="Times New Roman" w:hAnsi="Times New Roman" w:cs="Times New Roman"/>
+          <w:sz w:val="28"/>
+          <w:szCs w:val="28"/>
+        </w:rPr>
+        <w:t>db</w:t>
+      </w:r>
+      <w:proofErr w:type="spellEnd"/>
+    </w:p>
+    <w:p>
+      <w:pPr>
+        <w:pStyle w:val="NormalWeb"/>
+        <w:numPr>
+          <w:ilvl w:val="1"/>
+          <w:numId w:val="11"/>
+        </w:numPr>
+        <w:rPr>
+          <w:sz w:val="28"/>
+          <w:szCs w:val="28"/>
+        </w:rPr>
+      </w:pPr>
+      <w:r>
+        <w:rPr>
+          <w:sz w:val="28"/>
+          <w:szCs w:val="28"/>
+        </w:rPr>
+        <w:lastRenderedPageBreak/>
+        <w:t xml:space="preserve">Port: </w:t>
+      </w:r>
+      <w:r>
+        <w:rPr>
+          <w:rStyle w:val="HTMLCode"/>
+          <w:rFonts w:ascii="Times New Roman" w:hAnsi="Times New Roman" w:cs="Times New Roman"/>
+          <w:sz w:val="28"/>
+          <w:szCs w:val="28"/>
+        </w:rPr>
+        <w:t>5432</w:t>
+      </w:r>
+    </w:p>
+    <w:p>
+      <w:pPr>
+        <w:pStyle w:val="NormalWeb"/>
+        <w:numPr>
+          <w:ilvl w:val="1"/>
+          <w:numId w:val="11"/>
+        </w:numPr>
+        <w:rPr>
+          <w:sz w:val="28"/>
+          <w:szCs w:val="28"/>
+        </w:rPr>
+      </w:pPr>
+      <w:r>
+        <w:rPr>
+          <w:sz w:val="28"/>
+          <w:szCs w:val="28"/>
+        </w:rPr>
+        <w:t xml:space="preserve">Username: </w:t>
+      </w:r>
+      <w:proofErr w:type="spellStart"/>
+      <w:r>
+        <w:rPr>
+          <w:rStyle w:val="HTMLCode"/>
+          <w:rFonts w:ascii="Times New Roman" w:hAnsi="Times New Roman" w:cs="Times New Roman"/>
+          <w:sz w:val="28"/>
+          <w:szCs w:val="28"/>
+        </w:rPr>
+        <w:t>postgres</w:t>
+      </w:r>
+      <w:proofErr w:type="spellEnd"/>
+    </w:p>
+    <w:p>
+      <w:pPr>
+        <w:pStyle w:val="NormalWeb"/>
+        <w:numPr>
+          <w:ilvl w:val="1"/>
+          <w:numId w:val="11"/>
+        </w:numPr>
+        <w:rPr>
+          <w:sz w:val="28"/>
+          <w:szCs w:val="28"/>
+        </w:rPr>
+      </w:pPr>
+      <w:r>
+        <w:rPr>
+          <w:sz w:val="28"/>
+          <w:szCs w:val="28"/>
+        </w:rPr>
+        <w:t xml:space="preserve">Password: </w:t>
+      </w:r>
+      <w:proofErr w:type="spellStart"/>
+      <w:r>
+        <w:rPr>
+          <w:rStyle w:val="HTMLCode"/>
+          <w:rFonts w:ascii="Times New Roman" w:hAnsi="Times New Roman" w:cs="Times New Roman"/>
+          <w:sz w:val="28"/>
+          <w:szCs w:val="28"/>
+        </w:rPr>
+        <w:t>postgres</w:t>
+      </w:r>
+      <w:proofErr w:type="spellEnd"/>
+    </w:p>
+    <w:p>
+      <w:pPr>
+        <w:pStyle w:val="NormalWeb"/>
+        <w:numPr>
+          <w:ilvl w:val="1"/>
+          <w:numId w:val="11"/>
+        </w:numPr>
+        <w:rPr>
+          <w:sz w:val="28"/>
+          <w:szCs w:val="28"/>
+        </w:rPr>
+      </w:pPr>
+      <w:r>
+        <w:rPr>
+          <w:rFonts w:ascii="Segoe UI Symbol" w:hAnsi="Segoe UI Symbol" w:cs="Segoe UI Symbol"/>
+          <w:sz w:val="28"/>
+          <w:szCs w:val="28"/>
+        </w:rPr>
+        <w:t>✅</w:t>
+      </w:r>
+      <w:r>
+        <w:rPr>
+          <w:sz w:val="28"/>
+          <w:szCs w:val="28"/>
+        </w:rPr>
+        <w:t xml:space="preserve"> Enable </w:t>
+      </w:r>
+      <w:r>
+        <w:rPr>
+          <w:rStyle w:val="Strong"/>
+          <w:sz w:val="28"/>
+          <w:szCs w:val="28"/>
+        </w:rPr>
+        <w:t>Save Password</w:t>
+      </w:r>
+    </w:p>
+    <w:p>
+      <w:pPr>
+        <w:pStyle w:val="NormalWeb"/>
+        <w:numPr>
+          <w:ilvl w:val="0"/>
+          <w:numId w:val="11"/>
+        </w:numPr>
+        <w:rPr>
+          <w:sz w:val="28"/>
+          <w:szCs w:val="28"/>
+        </w:rPr>
+      </w:pPr>
+      <w:r>
+        <w:rPr>
+          <w:sz w:val="28"/>
+          <w:szCs w:val="28"/>
+        </w:rPr>
+        <w:t xml:space="preserve">Click </w:t>
+      </w:r>
+      <w:r>
+        <w:rPr>
+          <w:rStyle w:val="Strong"/>
+          <w:sz w:val="28"/>
+          <w:szCs w:val="28"/>
+        </w:rPr>
+        <w:t>Save</w:t>
+      </w:r>
+      <w:r>
+        <w:rPr>
+          <w:sz w:val="28"/>
+          <w:szCs w:val="28"/>
+        </w:rPr>
+        <w:t>.</w:t>
+      </w:r>
+      <w:r>
+        <w:rPr>
+          <w:sz w:val="28"/>
+          <w:szCs w:val="28"/>
+        </w:rPr>
         <w:br/>
-      </w:r>
+        <w:t xml:space="preserve">You will now have access to the database named </w:t>
+      </w:r>
+      <w:proofErr w:type="spellStart"/>
+      <w:r>
+        <w:rPr>
+          <w:rStyle w:val="HTMLCode"/>
+          <w:rFonts w:ascii="Times New Roman" w:hAnsi="Times New Roman" w:cs="Times New Roman"/>
+          <w:sz w:val="28"/>
+          <w:szCs w:val="28"/>
+        </w:rPr>
+        <w:t>fastapi_db</w:t>
+      </w:r>
+      <w:proofErr w:type="spellEnd"/>
+      <w:r>
+        <w:rPr>
+          <w:sz w:val="28"/>
+          <w:szCs w:val="28"/>
+        </w:rPr>
+        <w:t>.</w:t>
+      </w:r>
+    </w:p>
+    <w:p>
+      <w:pPr>
+        <w:rPr>
+          <w:rFonts w:ascii="Times New Roman" w:hAnsi="Times New Roman" w:cs="Times New Roman"/>
+          <w:sz w:val="28"/>
+        </w:rPr>
+      </w:pPr>
+      <w:r>
+        <w:rPr>
+          <w:rFonts w:ascii="Times New Roman" w:hAnsi="Times New Roman" w:cs="Times New Roman"/>
+          <w:sz w:val="28"/>
+        </w:rPr>
+        <w:pict>
+          <v:rect id="_x0000_i1047" style="width:0;height:1.5pt" o:hralign="center" o:hrstd="t" o:hr="t" fillcolor="#a0a0a0" stroked="f"/>
+        </w:pict>
+      </w:r>
+    </w:p>
+    <w:p>
+      <w:pPr>
+        <w:pStyle w:val="Heading3"/>
+        <w:rPr>
+          <w:rFonts w:ascii="Times New Roman" w:hAnsi="Times New Roman" w:cs="Times New Roman"/>
+          <w:sz w:val="28"/>
+          <w:szCs w:val="28"/>
+        </w:rPr>
+      </w:pPr>
+      <w:r>
+        <w:rPr>
+          <w:rStyle w:val="Strong"/>
+          <w:rFonts w:ascii="Times New Roman" w:hAnsi="Times New Roman" w:cs="Times New Roman"/>
+          <w:b w:val="0"/>
+          <w:bCs w:val="0"/>
+          <w:sz w:val="28"/>
+          <w:szCs w:val="28"/>
+        </w:rPr>
+        <w:t>7. Verify Database Tables</w:t>
+      </w:r>
+    </w:p>
+    <w:p>
+      <w:pPr>
+        <w:pStyle w:val="NormalWeb"/>
+        <w:rPr>
+          <w:sz w:val="28"/>
+          <w:szCs w:val="28"/>
+        </w:rPr>
+      </w:pPr>
+      <w:r>
+        <w:rPr>
+          <w:sz w:val="28"/>
+          <w:szCs w:val="28"/>
+        </w:rPr>
+        <w:t xml:space="preserve">After running the Alembic migration and seeding, the </w:t>
+      </w:r>
+      <w:proofErr w:type="spellStart"/>
+      <w:r>
+        <w:rPr>
+          <w:rStyle w:val="HTMLCode"/>
+          <w:rFonts w:ascii="Times New Roman" w:hAnsi="Times New Roman" w:cs="Times New Roman"/>
+          <w:sz w:val="28"/>
+          <w:szCs w:val="28"/>
+        </w:rPr>
+        <w:t>fastapi_db</w:t>
+      </w:r>
+      <w:proofErr w:type="spellEnd"/>
+      <w:r>
+        <w:rPr>
+          <w:sz w:val="28"/>
+          <w:szCs w:val="28"/>
+        </w:rPr>
+        <w:t xml:space="preserve"> database should contain the required tables and initial data. These can be viewed in </w:t>
+      </w:r>
+      <w:proofErr w:type="spellStart"/>
+      <w:r>
+        <w:rPr>
+          <w:sz w:val="28"/>
+          <w:szCs w:val="28"/>
+        </w:rPr>
+        <w:t>pgAdmin</w:t>
+      </w:r>
+      <w:proofErr w:type="spellEnd"/>
+      <w:r>
+        <w:rPr>
+          <w:sz w:val="28"/>
+          <w:szCs w:val="28"/>
+        </w:rPr>
+        <w:t xml:space="preserve"> under the server </w:t>
+      </w:r>
+      <w:proofErr w:type="spellStart"/>
+      <w:r>
+        <w:rPr>
+          <w:rStyle w:val="HTMLCode"/>
+          <w:rFonts w:ascii="Times New Roman" w:hAnsi="Times New Roman" w:cs="Times New Roman"/>
+          <w:sz w:val="28"/>
+          <w:szCs w:val="28"/>
+        </w:rPr>
+        <w:t>docker-postgres</w:t>
+      </w:r>
+      <w:proofErr w:type="spellEnd"/>
+      <w:r>
+        <w:rPr>
+          <w:sz w:val="28"/>
+          <w:szCs w:val="28"/>
+        </w:rPr>
+        <w:t>.</w:t>
+      </w:r>
+    </w:p>
+    <w:p>
+      <w:pPr>
+        <w:rPr>
+          <w:rFonts w:ascii="Times New Roman" w:hAnsi="Times New Roman" w:cs="Times New Roman"/>
+          <w:sz w:val="28"/>
+        </w:rPr>
+      </w:pPr>
+      <w:r>
+        <w:rPr>
+          <w:rFonts w:ascii="Times New Roman" w:hAnsi="Times New Roman" w:cs="Times New Roman"/>
+          <w:sz w:val="28"/>
+        </w:rPr>
+        <w:pict>
+          <v:rect id="_x0000_i1048" style="width:0;height:1.5pt" o:hralign="center" o:hrstd="t" o:hr="t" fillcolor="#a0a0a0" stroked="f"/>
+        </w:pict>
+      </w:r>
+    </w:p>
+    <w:p>
+      <w:pPr>
+        <w:pStyle w:val="Heading3"/>
+        <w:rPr>
+          <w:rFonts w:ascii="Times New Roman" w:hAnsi="Times New Roman" w:cs="Times New Roman"/>
+          <w:sz w:val="28"/>
+          <w:szCs w:val="28"/>
+        </w:rPr>
+      </w:pPr>
       <w:r>
         <w:rPr>
           <w:rFonts w:ascii="Segoe UI Symbol" w:hAnsi="Segoe UI Symbol" w:cs="Segoe UI Symbol"/>
+          <w:sz w:val="28"/>
+          <w:szCs w:val="28"/>
+        </w:rPr>
+        <w:t>🔐</w:t>
+      </w:r>
+      <w:r>
+        <w:rPr>
+          <w:rFonts w:ascii="Times New Roman" w:hAnsi="Times New Roman" w:cs="Times New Roman"/>
+          <w:sz w:val="28"/>
+          <w:szCs w:val="28"/>
+        </w:rPr>
+        <w:t xml:space="preserve"> </w:t>
+      </w:r>
+      <w:r>
+        <w:rPr>
+          <w:rStyle w:val="Strong"/>
+          <w:rFonts w:ascii="Times New Roman" w:hAnsi="Times New Roman" w:cs="Times New Roman"/>
+          <w:b w:val="0"/>
+          <w:bCs w:val="0"/>
+          <w:sz w:val="28"/>
+          <w:szCs w:val="28"/>
+        </w:rPr>
+        <w:t>8. Create a New Admin User via Swagger (If Locked Out)</w:t>
+      </w:r>
+    </w:p>
+    <w:p>
+      <w:pPr>
+        <w:pStyle w:val="NormalWeb"/>
+        <w:rPr>
+          <w:sz w:val="28"/>
+          <w:szCs w:val="28"/>
+        </w:rPr>
+      </w:pPr>
+      <w:r>
+        <w:rPr>
+          <w:sz w:val="28"/>
+          <w:szCs w:val="28"/>
+        </w:rPr>
+        <w:t>If you're unable to log in via the frontend (e.g., due to a forgotten password and no admin account exists), follow these steps:</w:t>
+      </w:r>
+    </w:p>
+    <w:p>
+      <w:pPr>
+        <w:pStyle w:val="NormalWeb"/>
+        <w:numPr>
+          <w:ilvl w:val="0"/>
+          <w:numId w:val="12"/>
+        </w:numPr>
+        <w:rPr>
+          <w:sz w:val="28"/>
+          <w:szCs w:val="28"/>
+        </w:rPr>
+      </w:pPr>
+      <w:r>
+        <w:rPr>
+          <w:sz w:val="28"/>
+          <w:szCs w:val="28"/>
+        </w:rPr>
+        <w:t>Open the Swagger UI at:</w:t>
+      </w:r>
+      <w:r>
+        <w:rPr>
+          <w:sz w:val="28"/>
+          <w:szCs w:val="28"/>
+        </w:rPr>
+        <w:br/>
+      </w:r>
+      <w:r>
+        <w:rPr>
+          <w:rFonts w:ascii="Segoe UI Symbol" w:hAnsi="Segoe UI Symbol" w:cs="Segoe UI Symbol"/>
+          <w:sz w:val="28"/>
+          <w:szCs w:val="28"/>
         </w:rPr>
         <w:t>👉</w:t>
       </w:r>
       <w:r>
+        <w:rPr>
+          <w:sz w:val="28"/>
+          <w:szCs w:val="28"/>
+        </w:rPr>
         <w:t xml:space="preserve"> </w:t>
       </w:r>
       <w:hyperlink r:id="rId9" w:tgtFrame="_new" w:history="1">
@@ -1447,14 +1929,516 @@
           <w:rPr>
             <w:rStyle w:val="Hyperlink"/>
             <w:rFonts w:eastAsiaTheme="majorEastAsia"/>
-            <w:b/>
-            <w:bCs/>
+            <w:sz w:val="28"/>
+            <w:szCs w:val="28"/>
+          </w:rPr>
+          <w:t>http://localhost:8000/docs</w:t>
+        </w:r>
+      </w:hyperlink>
+    </w:p>
+    <w:p>
+      <w:pPr>
+        <w:pStyle w:val="NormalWeb"/>
+        <w:numPr>
+          <w:ilvl w:val="0"/>
+          <w:numId w:val="12"/>
+        </w:numPr>
+        <w:rPr>
+          <w:sz w:val="28"/>
+          <w:szCs w:val="28"/>
+        </w:rPr>
+      </w:pPr>
+      <w:r>
+        <w:rPr>
+          <w:sz w:val="28"/>
+          <w:szCs w:val="28"/>
+        </w:rPr>
+        <w:t>Look for the endpoint:</w:t>
+      </w:r>
+    </w:p>
+    <w:p>
+      <w:pPr>
+        <w:pStyle w:val="NormalWeb"/>
+        <w:numPr>
+          <w:ilvl w:val="1"/>
+          <w:numId w:val="12"/>
+        </w:numPr>
+        <w:rPr>
+          <w:sz w:val="28"/>
+          <w:szCs w:val="28"/>
+        </w:rPr>
+      </w:pPr>
+      <w:r>
+        <w:rPr>
+          <w:rStyle w:val="HTMLCode"/>
+          <w:rFonts w:ascii="Times New Roman" w:hAnsi="Times New Roman" w:cs="Times New Roman"/>
+          <w:sz w:val="28"/>
+          <w:szCs w:val="28"/>
+        </w:rPr>
+        <w:t>POST /users/</w:t>
+      </w:r>
+      <w:r>
+        <w:rPr>
+          <w:sz w:val="28"/>
+          <w:szCs w:val="28"/>
+        </w:rPr>
+        <w:t xml:space="preserve"> (usually under the </w:t>
+      </w:r>
+      <w:r>
+        <w:rPr>
+          <w:rStyle w:val="Strong"/>
+          <w:sz w:val="28"/>
+          <w:szCs w:val="28"/>
+        </w:rPr>
+        <w:t>Users</w:t>
+      </w:r>
+      <w:r>
+        <w:rPr>
+          <w:sz w:val="28"/>
+          <w:szCs w:val="28"/>
+        </w:rPr>
+        <w:t xml:space="preserve"> section)</w:t>
+      </w:r>
+    </w:p>
+    <w:p>
+      <w:pPr>
+        <w:pStyle w:val="NormalWeb"/>
+        <w:numPr>
+          <w:ilvl w:val="0"/>
+          <w:numId w:val="12"/>
+        </w:numPr>
+        <w:rPr>
+          <w:sz w:val="28"/>
+          <w:szCs w:val="28"/>
+        </w:rPr>
+      </w:pPr>
+      <w:r>
+        <w:rPr>
+          <w:sz w:val="28"/>
+          <w:szCs w:val="28"/>
+        </w:rPr>
+        <w:t xml:space="preserve">Click </w:t>
+      </w:r>
+      <w:r>
+        <w:rPr>
+          <w:rStyle w:val="Strong"/>
+          <w:sz w:val="28"/>
+          <w:szCs w:val="28"/>
+        </w:rPr>
+        <w:t>Try it out</w:t>
+      </w:r>
+      <w:r>
+        <w:rPr>
+          <w:sz w:val="28"/>
+          <w:szCs w:val="28"/>
+        </w:rPr>
+        <w:t>, then enter the user details in JSON format:</w:t>
+      </w:r>
+    </w:p>
+    <w:p>
+      <w:pPr>
+        <w:pStyle w:val="HTMLPreformatted"/>
+        <w:rPr>
+          <w:rFonts w:ascii="Times New Roman" w:hAnsi="Times New Roman" w:cs="Times New Roman"/>
+          <w:sz w:val="28"/>
+          <w:szCs w:val="28"/>
+        </w:rPr>
+      </w:pPr>
+      <w:proofErr w:type="spellStart"/>
+      <w:r>
+        <w:rPr>
+          <w:rFonts w:ascii="Times New Roman" w:hAnsi="Times New Roman" w:cs="Times New Roman"/>
+          <w:sz w:val="28"/>
+          <w:szCs w:val="28"/>
+        </w:rPr>
+        <w:t>json</w:t>
+      </w:r>
+      <w:proofErr w:type="spellEnd"/>
+    </w:p>
+    <w:p>
+      <w:pPr>
+        <w:pStyle w:val="HTMLPreformatted"/>
+        <w:rPr>
+          <w:rFonts w:ascii="Times New Roman" w:hAnsi="Times New Roman" w:cs="Times New Roman"/>
+          <w:sz w:val="28"/>
+          <w:szCs w:val="28"/>
+        </w:rPr>
+      </w:pPr>
+      <w:proofErr w:type="spellStart"/>
+      <w:r>
+        <w:rPr>
+          <w:rFonts w:ascii="Times New Roman" w:hAnsi="Times New Roman" w:cs="Times New Roman"/>
+          <w:sz w:val="28"/>
+          <w:szCs w:val="28"/>
+        </w:rPr>
+        <w:t>CopyEdit</w:t>
+      </w:r>
+      <w:proofErr w:type="spellEnd"/>
+    </w:p>
+    <w:p>
+      <w:pPr>
+        <w:pStyle w:val="HTMLPreformatted"/>
+        <w:rPr>
+          <w:rStyle w:val="HTMLCode"/>
+          <w:rFonts w:ascii="Times New Roman" w:hAnsi="Times New Roman" w:cs="Times New Roman"/>
+          <w:sz w:val="28"/>
+          <w:szCs w:val="28"/>
+        </w:rPr>
+      </w:pPr>
+      <w:r>
+        <w:rPr>
+          <w:rStyle w:val="hljs-punctuation"/>
+          <w:rFonts w:ascii="Times New Roman" w:hAnsi="Times New Roman" w:cs="Times New Roman"/>
+          <w:sz w:val="28"/>
+          <w:szCs w:val="28"/>
+        </w:rPr>
+        <w:t>{</w:t>
+      </w:r>
+    </w:p>
+    <w:p>
+      <w:pPr>
+        <w:pStyle w:val="HTMLPreformatted"/>
+        <w:rPr>
+          <w:rStyle w:val="HTMLCode"/>
+          <w:rFonts w:ascii="Times New Roman" w:hAnsi="Times New Roman" w:cs="Times New Roman"/>
+          <w:sz w:val="28"/>
+          <w:szCs w:val="28"/>
+        </w:rPr>
+      </w:pPr>
+      <w:r>
+        <w:rPr>
+          <w:rStyle w:val="HTMLCode"/>
+          <w:rFonts w:ascii="Times New Roman" w:hAnsi="Times New Roman" w:cs="Times New Roman"/>
+          <w:sz w:val="28"/>
+          <w:szCs w:val="28"/>
+        </w:rPr>
+        <w:t xml:space="preserve">  </w:t>
+      </w:r>
+      <w:r>
+        <w:rPr>
+          <w:rStyle w:val="hljs-attr"/>
+          <w:rFonts w:ascii="Times New Roman" w:hAnsi="Times New Roman" w:cs="Times New Roman"/>
+          <w:sz w:val="28"/>
+          <w:szCs w:val="28"/>
+        </w:rPr>
+        <w:t>"email"</w:t>
+      </w:r>
+      <w:r>
+        <w:rPr>
+          <w:rStyle w:val="hljs-punctuation"/>
+          <w:rFonts w:ascii="Times New Roman" w:hAnsi="Times New Roman" w:cs="Times New Roman"/>
+          <w:sz w:val="28"/>
+          <w:szCs w:val="28"/>
+        </w:rPr>
+        <w:t>:</w:t>
+      </w:r>
+      <w:r>
+        <w:rPr>
+          <w:rStyle w:val="HTMLCode"/>
+          <w:rFonts w:ascii="Times New Roman" w:hAnsi="Times New Roman" w:cs="Times New Roman"/>
+          <w:sz w:val="28"/>
+          <w:szCs w:val="28"/>
+        </w:rPr>
+        <w:t xml:space="preserve"> </w:t>
+      </w:r>
+      <w:r>
+        <w:rPr>
+          <w:rStyle w:val="hljs-string"/>
+          <w:rFonts w:ascii="Times New Roman" w:hAnsi="Times New Roman" w:cs="Times New Roman"/>
+          <w:sz w:val="28"/>
+          <w:szCs w:val="28"/>
+        </w:rPr>
+        <w:t>"newadmin@example.com"</w:t>
+      </w:r>
+      <w:r>
+        <w:rPr>
+          <w:rStyle w:val="hljs-punctuation"/>
+          <w:rFonts w:ascii="Times New Roman" w:hAnsi="Times New Roman" w:cs="Times New Roman"/>
+          <w:sz w:val="28"/>
+          <w:szCs w:val="28"/>
+        </w:rPr>
+        <w:t>,</w:t>
+      </w:r>
+    </w:p>
+    <w:p>
+      <w:pPr>
+        <w:pStyle w:val="HTMLPreformatted"/>
+        <w:rPr>
+          <w:rStyle w:val="HTMLCode"/>
+          <w:rFonts w:ascii="Times New Roman" w:hAnsi="Times New Roman" w:cs="Times New Roman"/>
+          <w:sz w:val="28"/>
+          <w:szCs w:val="28"/>
+        </w:rPr>
+      </w:pPr>
+      <w:r>
+        <w:rPr>
+          <w:rStyle w:val="HTMLCode"/>
+          <w:rFonts w:ascii="Times New Roman" w:hAnsi="Times New Roman" w:cs="Times New Roman"/>
+          <w:sz w:val="28"/>
+          <w:szCs w:val="28"/>
+        </w:rPr>
+        <w:t xml:space="preserve">  </w:t>
+      </w:r>
+      <w:r>
+        <w:rPr>
+          <w:rStyle w:val="hljs-attr"/>
+          <w:rFonts w:ascii="Times New Roman" w:hAnsi="Times New Roman" w:cs="Times New Roman"/>
+          <w:sz w:val="28"/>
+          <w:szCs w:val="28"/>
+        </w:rPr>
+        <w:t>"password"</w:t>
+      </w:r>
+      <w:r>
+        <w:rPr>
+          <w:rStyle w:val="hljs-punctuation"/>
+          <w:rFonts w:ascii="Times New Roman" w:hAnsi="Times New Roman" w:cs="Times New Roman"/>
+          <w:sz w:val="28"/>
+          <w:szCs w:val="28"/>
+        </w:rPr>
+        <w:t>:</w:t>
+      </w:r>
+      <w:r>
+        <w:rPr>
+          <w:rStyle w:val="HTMLCode"/>
+          <w:rFonts w:ascii="Times New Roman" w:hAnsi="Times New Roman" w:cs="Times New Roman"/>
+          <w:sz w:val="28"/>
+          <w:szCs w:val="28"/>
+        </w:rPr>
+        <w:t xml:space="preserve"> </w:t>
+      </w:r>
+      <w:r>
+        <w:rPr>
+          <w:rStyle w:val="hljs-string"/>
+          <w:rFonts w:ascii="Times New Roman" w:hAnsi="Times New Roman" w:cs="Times New Roman"/>
+          <w:sz w:val="28"/>
+          <w:szCs w:val="28"/>
+        </w:rPr>
+        <w:t>"</w:t>
+      </w:r>
+      <w:proofErr w:type="spellStart"/>
+      <w:r>
+        <w:rPr>
+          <w:rStyle w:val="hljs-string"/>
+          <w:rFonts w:ascii="Times New Roman" w:hAnsi="Times New Roman" w:cs="Times New Roman"/>
+          <w:sz w:val="28"/>
+          <w:szCs w:val="28"/>
+        </w:rPr>
+        <w:t>yoursecurepassword</w:t>
+      </w:r>
+      <w:proofErr w:type="spellEnd"/>
+      <w:r>
+        <w:rPr>
+          <w:rStyle w:val="hljs-string"/>
+          <w:rFonts w:ascii="Times New Roman" w:hAnsi="Times New Roman" w:cs="Times New Roman"/>
+          <w:sz w:val="28"/>
+          <w:szCs w:val="28"/>
+        </w:rPr>
+        <w:t>"</w:t>
+      </w:r>
+      <w:r>
+        <w:rPr>
+          <w:rStyle w:val="hljs-punctuation"/>
+          <w:rFonts w:ascii="Times New Roman" w:hAnsi="Times New Roman" w:cs="Times New Roman"/>
+          <w:sz w:val="28"/>
+          <w:szCs w:val="28"/>
+        </w:rPr>
+        <w:t>,</w:t>
+      </w:r>
+    </w:p>
+    <w:p>
+      <w:pPr>
+        <w:pStyle w:val="HTMLPreformatted"/>
+        <w:rPr>
+          <w:rStyle w:val="HTMLCode"/>
+          <w:rFonts w:ascii="Times New Roman" w:hAnsi="Times New Roman" w:cs="Times New Roman"/>
+          <w:sz w:val="28"/>
+          <w:szCs w:val="28"/>
+        </w:rPr>
+      </w:pPr>
+      <w:r>
+        <w:rPr>
+          <w:rStyle w:val="HTMLCode"/>
+          <w:rFonts w:ascii="Times New Roman" w:hAnsi="Times New Roman" w:cs="Times New Roman"/>
+          <w:sz w:val="28"/>
+          <w:szCs w:val="28"/>
+        </w:rPr>
+        <w:t xml:space="preserve">  </w:t>
+      </w:r>
+      <w:r>
+        <w:rPr>
+          <w:rStyle w:val="hljs-attr"/>
+          <w:rFonts w:ascii="Times New Roman" w:hAnsi="Times New Roman" w:cs="Times New Roman"/>
+          <w:sz w:val="28"/>
+          <w:szCs w:val="28"/>
+        </w:rPr>
+        <w:t>"</w:t>
+      </w:r>
+      <w:proofErr w:type="spellStart"/>
+      <w:r>
+        <w:rPr>
+          <w:rStyle w:val="hljs-attr"/>
+          <w:rFonts w:ascii="Times New Roman" w:hAnsi="Times New Roman" w:cs="Times New Roman"/>
+          <w:sz w:val="28"/>
+          <w:szCs w:val="28"/>
+        </w:rPr>
+        <w:t>full_name</w:t>
+      </w:r>
+      <w:proofErr w:type="spellEnd"/>
+      <w:r>
+        <w:rPr>
+          <w:rStyle w:val="hljs-attr"/>
+          <w:rFonts w:ascii="Times New Roman" w:hAnsi="Times New Roman" w:cs="Times New Roman"/>
+          <w:sz w:val="28"/>
+          <w:szCs w:val="28"/>
+        </w:rPr>
+        <w:t>"</w:t>
+      </w:r>
+      <w:r>
+        <w:rPr>
+          <w:rStyle w:val="hljs-punctuation"/>
+          <w:rFonts w:ascii="Times New Roman" w:hAnsi="Times New Roman" w:cs="Times New Roman"/>
+          <w:sz w:val="28"/>
+          <w:szCs w:val="28"/>
+        </w:rPr>
+        <w:t>:</w:t>
+      </w:r>
+      <w:r>
+        <w:rPr>
+          <w:rStyle w:val="HTMLCode"/>
+          <w:rFonts w:ascii="Times New Roman" w:hAnsi="Times New Roman" w:cs="Times New Roman"/>
+          <w:sz w:val="28"/>
+          <w:szCs w:val="28"/>
+        </w:rPr>
+        <w:t xml:space="preserve"> </w:t>
+      </w:r>
+      <w:r>
+        <w:rPr>
+          <w:rStyle w:val="hljs-string"/>
+          <w:rFonts w:ascii="Times New Roman" w:hAnsi="Times New Roman" w:cs="Times New Roman"/>
+          <w:sz w:val="28"/>
+          <w:szCs w:val="28"/>
+        </w:rPr>
+        <w:t>"New Admin"</w:t>
+      </w:r>
+      <w:bookmarkStart w:id="0" w:name="_GoBack"/>
+      <w:bookmarkEnd w:id="0"/>
+    </w:p>
+    <w:p>
+      <w:pPr>
+        <w:pStyle w:val="HTMLPreformatted"/>
+        <w:rPr>
+          <w:rStyle w:val="HTMLCode"/>
+          <w:rFonts w:ascii="Times New Roman" w:hAnsi="Times New Roman" w:cs="Times New Roman"/>
+          <w:sz w:val="28"/>
+          <w:szCs w:val="28"/>
+        </w:rPr>
+      </w:pPr>
+      <w:r>
+        <w:rPr>
+          <w:rStyle w:val="hljs-punctuation"/>
+          <w:rFonts w:ascii="Times New Roman" w:hAnsi="Times New Roman" w:cs="Times New Roman"/>
+          <w:sz w:val="28"/>
+          <w:szCs w:val="28"/>
+        </w:rPr>
+        <w:t>}</w:t>
+      </w:r>
+    </w:p>
+    <w:p>
+      <w:pPr>
+        <w:pStyle w:val="NormalWeb"/>
+        <w:numPr>
+          <w:ilvl w:val="0"/>
+          <w:numId w:val="13"/>
+        </w:numPr>
+        <w:rPr>
+          <w:sz w:val="28"/>
+          <w:szCs w:val="28"/>
+        </w:rPr>
+      </w:pPr>
+      <w:r>
+        <w:rPr>
+          <w:sz w:val="28"/>
+          <w:szCs w:val="28"/>
+        </w:rPr>
+        <w:t xml:space="preserve">Click </w:t>
+      </w:r>
+      <w:r>
+        <w:rPr>
+          <w:rStyle w:val="Strong"/>
+          <w:sz w:val="28"/>
+          <w:szCs w:val="28"/>
+        </w:rPr>
+        <w:t>Execute</w:t>
+      </w:r>
+      <w:r>
+        <w:rPr>
+          <w:sz w:val="28"/>
+          <w:szCs w:val="28"/>
+        </w:rPr>
+        <w:t>. If successful, this will create a new admin account.</w:t>
+      </w:r>
+    </w:p>
+    <w:p>
+      <w:pPr>
+        <w:pStyle w:val="NormalWeb"/>
+        <w:numPr>
+          <w:ilvl w:val="0"/>
+          <w:numId w:val="13"/>
+        </w:numPr>
+        <w:rPr>
+          <w:sz w:val="28"/>
+          <w:szCs w:val="28"/>
+        </w:rPr>
+      </w:pPr>
+      <w:r>
+        <w:rPr>
+          <w:sz w:val="28"/>
+          <w:szCs w:val="28"/>
+        </w:rPr>
+        <w:t>Use the new credentials to log in at:</w:t>
+      </w:r>
+      <w:r>
+        <w:rPr>
+          <w:sz w:val="28"/>
+          <w:szCs w:val="28"/>
+        </w:rPr>
+        <w:br/>
+      </w:r>
+      <w:r>
+        <w:rPr>
+          <w:rFonts w:ascii="Segoe UI Symbol" w:hAnsi="Segoe UI Symbol" w:cs="Segoe UI Symbol"/>
+          <w:sz w:val="28"/>
+          <w:szCs w:val="28"/>
+        </w:rPr>
+        <w:t>👉</w:t>
+      </w:r>
+      <w:r>
+        <w:rPr>
+          <w:sz w:val="28"/>
+          <w:szCs w:val="28"/>
+        </w:rPr>
+        <w:t xml:space="preserve"> </w:t>
+      </w:r>
+      <w:hyperlink r:id="rId10" w:tgtFrame="_new" w:history="1">
+        <w:r>
+          <w:rPr>
+            <w:rStyle w:val="Hyperlink"/>
+            <w:rFonts w:eastAsiaTheme="majorEastAsia"/>
+            <w:sz w:val="28"/>
+            <w:szCs w:val="28"/>
           </w:rPr>
           <w:t>http://localhost:5173</w:t>
         </w:r>
       </w:hyperlink>
     </w:p>
-    <w:p/>
+    <w:p>
+      <w:pPr>
+        <w:rPr>
+          <w:rFonts w:ascii="Times New Roman" w:hAnsi="Times New Roman" w:cs="Times New Roman"/>
+          <w:sz w:val="28"/>
+        </w:rPr>
+      </w:pPr>
+    </w:p>
     <w:sectPr>
       <w:pgSz w:w="12240" w:h="15840"/>
       <w:pgMar w:top="1440" w:right="1440" w:bottom="1440" w:left="1440" w:header="720" w:footer="720" w:gutter="0"/>
@@ -1468,6 +2452,123 @@
 <file path=word/numbering.xml><?xml version="1.0" encoding="utf-8"?>
 <w:numbering xmlns:wpc="http://schemas.microsoft.com/office/word/2010/wordprocessingCanvas" xmlns:cx="http://schemas.microsoft.com/office/drawing/2014/chartex" xmlns:cx1="http://schemas.microsoft.com/office/drawing/2015/9/8/chartex" xmlns:mc="http://schemas.openxmlformats.org/markup-compatibility/2006" xmlns:o="urn:schemas-microsoft-com:office:office" xmlns:r="http://schemas.openxmlformats.org/officeDocument/2006/relationships" xmlns:m="http://schemas.openxmlformats.org/officeDocument/2006/math" xmlns:v="urn:schemas-microsoft-com:vml" xmlns:wp14="http://schemas.microsoft.com/office/word/2010/wordprocessingDrawing" xmlns:wp="http://schemas.openxmlformats.org/drawingml/2006/wordprocessingDrawing" xmlns:w10="urn:schemas-microsoft-com:office:word" xmlns:w="http://schemas.openxmlformats.org/wordprocessingml/2006/main" xmlns:w14="http://schemas.microsoft.com/office/word/2010/wordml" xmlns:w15="http://schemas.microsoft.com/office/word/2012/wordml" xmlns:w16se="http://schemas.microsoft.com/office/word/2015/wordml/symex" xmlns:wpg="http://schemas.microsoft.com/office/word/2010/wordprocessingGroup" xmlns:wpi="http://schemas.microsoft.com/office/word/2010/wordprocessingInk" xmlns:wne="http://schemas.microsoft.com/office/word/2006/wordml" xmlns:wps="http://schemas.microsoft.com/office/word/2010/wordprocessingShape" mc:Ignorable="w14 w15 w16se wp14">
   <w:abstractNum w:abstractNumId="0" w15:restartNumberingAfterBreak="0">
+    <w:nsid w:val="068F5A56"/>
+    <w:multiLevelType w:val="multilevel"/>
+    <w:tmpl w:val="CBA63D08"/>
+    <w:lvl w:ilvl="0">
+      <w:start w:val="1"/>
+      <w:numFmt w:val="decimal"/>
+      <w:lvlText w:val="%1."/>
+      <w:lvlJc w:val="left"/>
+      <w:pPr>
+        <w:tabs>
+          <w:tab w:val="num" w:pos="720"/>
+        </w:tabs>
+        <w:ind w:left="720" w:hanging="360"/>
+      </w:pPr>
+    </w:lvl>
+    <w:lvl w:ilvl="1">
+      <w:start w:val="1"/>
+      <w:numFmt w:val="bullet"/>
+      <w:lvlText w:val="o"/>
+      <w:lvlJc w:val="left"/>
+      <w:pPr>
+        <w:tabs>
+          <w:tab w:val="num" w:pos="1440"/>
+        </w:tabs>
+        <w:ind w:left="1440" w:hanging="360"/>
+      </w:pPr>
+      <w:rPr>
+        <w:rFonts w:ascii="Courier New" w:hAnsi="Courier New" w:hint="default"/>
+        <w:sz w:val="20"/>
+      </w:rPr>
+    </w:lvl>
+    <w:lvl w:ilvl="2" w:tentative="1">
+      <w:start w:val="1"/>
+      <w:numFmt w:val="decimal"/>
+      <w:lvlText w:val="%3."/>
+      <w:lvlJc w:val="left"/>
+      <w:pPr>
+        <w:tabs>
+          <w:tab w:val="num" w:pos="2160"/>
+        </w:tabs>
+        <w:ind w:left="2160" w:hanging="360"/>
+      </w:pPr>
+    </w:lvl>
+    <w:lvl w:ilvl="3" w:tentative="1">
+      <w:start w:val="1"/>
+      <w:numFmt w:val="decimal"/>
+      <w:lvlText w:val="%4."/>
+      <w:lvlJc w:val="left"/>
+      <w:pPr>
+        <w:tabs>
+          <w:tab w:val="num" w:pos="2880"/>
+        </w:tabs>
+        <w:ind w:left="2880" w:hanging="360"/>
+      </w:pPr>
+    </w:lvl>
+    <w:lvl w:ilvl="4" w:tentative="1">
+      <w:start w:val="1"/>
+      <w:numFmt w:val="decimal"/>
+      <w:lvlText w:val="%5."/>
+      <w:lvlJc w:val="left"/>
+      <w:pPr>
+        <w:tabs>
+          <w:tab w:val="num" w:pos="3600"/>
+        </w:tabs>
+        <w:ind w:left="3600" w:hanging="360"/>
+      </w:pPr>
+    </w:lvl>
+    <w:lvl w:ilvl="5" w:tentative="1">
+      <w:start w:val="1"/>
+      <w:numFmt w:val="decimal"/>
+      <w:lvlText w:val="%6."/>
+      <w:lvlJc w:val="left"/>
+      <w:pPr>
+        <w:tabs>
+          <w:tab w:val="num" w:pos="4320"/>
+        </w:tabs>
+        <w:ind w:left="4320" w:hanging="360"/>
+      </w:pPr>
+    </w:lvl>
+    <w:lvl w:ilvl="6" w:tentative="1">
+      <w:start w:val="1"/>
+      <w:numFmt w:val="decimal"/>
+      <w:lvlText w:val="%7."/>
+      <w:lvlJc w:val="left"/>
+      <w:pPr>
+        <w:tabs>
+          <w:tab w:val="num" w:pos="5040"/>
+        </w:tabs>
+        <w:ind w:left="5040" w:hanging="360"/>
+      </w:pPr>
+    </w:lvl>
+    <w:lvl w:ilvl="7" w:tentative="1">
+      <w:start w:val="1"/>
+      <w:numFmt w:val="decimal"/>
+      <w:lvlText w:val="%8."/>
+      <w:lvlJc w:val="left"/>
+      <w:pPr>
+        <w:tabs>
+          <w:tab w:val="num" w:pos="5760"/>
+        </w:tabs>
+        <w:ind w:left="5760" w:hanging="360"/>
+      </w:pPr>
+    </w:lvl>
+    <w:lvl w:ilvl="8" w:tentative="1">
+      <w:start w:val="1"/>
+      <w:numFmt w:val="decimal"/>
+      <w:lvlText w:val="%9."/>
+      <w:lvlJc w:val="left"/>
+      <w:pPr>
+        <w:tabs>
+          <w:tab w:val="num" w:pos="6480"/>
+        </w:tabs>
+        <w:ind w:left="6480" w:hanging="360"/>
+      </w:pPr>
+    </w:lvl>
+  </w:abstractNum>
+  <w:abstractNum w:abstractNumId="1" w15:restartNumberingAfterBreak="0">
     <w:nsid w:val="15341A8A"/>
     <w:multiLevelType w:val="multilevel"/>
     <w:tmpl w:val="BDB2FA36"/>
@@ -1616,7 +2717,7 @@
       </w:rPr>
     </w:lvl>
   </w:abstractNum>
-  <w:abstractNum w:abstractNumId="1" w15:restartNumberingAfterBreak="0">
+  <w:abstractNum w:abstractNumId="2" w15:restartNumberingAfterBreak="0">
     <w:nsid w:val="175D1120"/>
     <w:multiLevelType w:val="multilevel"/>
     <w:tmpl w:val="76E6E91C"/>
@@ -1733,7 +2834,237 @@
       </w:pPr>
     </w:lvl>
   </w:abstractNum>
-  <w:abstractNum w:abstractNumId="2" w15:restartNumberingAfterBreak="0">
+  <w:abstractNum w:abstractNumId="3" w15:restartNumberingAfterBreak="0">
+    <w:nsid w:val="2D653415"/>
+    <w:multiLevelType w:val="multilevel"/>
+    <w:tmpl w:val="AA4460F6"/>
+    <w:lvl w:ilvl="0">
+      <w:start w:val="4"/>
+      <w:numFmt w:val="decimal"/>
+      <w:lvlText w:val="%1."/>
+      <w:lvlJc w:val="left"/>
+      <w:pPr>
+        <w:tabs>
+          <w:tab w:val="num" w:pos="720"/>
+        </w:tabs>
+        <w:ind w:left="720" w:hanging="360"/>
+      </w:pPr>
+    </w:lvl>
+    <w:lvl w:ilvl="1" w:tentative="1">
+      <w:start w:val="1"/>
+      <w:numFmt w:val="decimal"/>
+      <w:lvlText w:val="%2."/>
+      <w:lvlJc w:val="left"/>
+      <w:pPr>
+        <w:tabs>
+          <w:tab w:val="num" w:pos="1440"/>
+        </w:tabs>
+        <w:ind w:left="1440" w:hanging="360"/>
+      </w:pPr>
+    </w:lvl>
+    <w:lvl w:ilvl="2" w:tentative="1">
+      <w:start w:val="1"/>
+      <w:numFmt w:val="decimal"/>
+      <w:lvlText w:val="%3."/>
+      <w:lvlJc w:val="left"/>
+      <w:pPr>
+        <w:tabs>
+          <w:tab w:val="num" w:pos="2160"/>
+        </w:tabs>
+        <w:ind w:left="2160" w:hanging="360"/>
+      </w:pPr>
+    </w:lvl>
+    <w:lvl w:ilvl="3" w:tentative="1">
+      <w:start w:val="1"/>
+      <w:numFmt w:val="decimal"/>
+      <w:lvlText w:val="%4."/>
+      <w:lvlJc w:val="left"/>
+      <w:pPr>
+        <w:tabs>
+          <w:tab w:val="num" w:pos="2880"/>
+        </w:tabs>
+        <w:ind w:left="2880" w:hanging="360"/>
+      </w:pPr>
+    </w:lvl>
+    <w:lvl w:ilvl="4" w:tentative="1">
+      <w:start w:val="1"/>
+      <w:numFmt w:val="decimal"/>
+      <w:lvlText w:val="%5."/>
+      <w:lvlJc w:val="left"/>
+      <w:pPr>
+        <w:tabs>
+          <w:tab w:val="num" w:pos="3600"/>
+        </w:tabs>
+        <w:ind w:left="3600" w:hanging="360"/>
+      </w:pPr>
+    </w:lvl>
+    <w:lvl w:ilvl="5" w:tentative="1">
+      <w:start w:val="1"/>
+      <w:numFmt w:val="decimal"/>
+      <w:lvlText w:val="%6."/>
+      <w:lvlJc w:val="left"/>
+      <w:pPr>
+        <w:tabs>
+          <w:tab w:val="num" w:pos="4320"/>
+        </w:tabs>
+        <w:ind w:left="4320" w:hanging="360"/>
+      </w:pPr>
+    </w:lvl>
+    <w:lvl w:ilvl="6" w:tentative="1">
+      <w:start w:val="1"/>
+      <w:numFmt w:val="decimal"/>
+      <w:lvlText w:val="%7."/>
+      <w:lvlJc w:val="left"/>
+      <w:pPr>
+        <w:tabs>
+          <w:tab w:val="num" w:pos="5040"/>
+        </w:tabs>
+        <w:ind w:left="5040" w:hanging="360"/>
+      </w:pPr>
+    </w:lvl>
+    <w:lvl w:ilvl="7" w:tentative="1">
+      <w:start w:val="1"/>
+      <w:numFmt w:val="decimal"/>
+      <w:lvlText w:val="%8."/>
+      <w:lvlJc w:val="left"/>
+      <w:pPr>
+        <w:tabs>
+          <w:tab w:val="num" w:pos="5760"/>
+        </w:tabs>
+        <w:ind w:left="5760" w:hanging="360"/>
+      </w:pPr>
+    </w:lvl>
+    <w:lvl w:ilvl="8" w:tentative="1">
+      <w:start w:val="1"/>
+      <w:numFmt w:val="decimal"/>
+      <w:lvlText w:val="%9."/>
+      <w:lvlJc w:val="left"/>
+      <w:pPr>
+        <w:tabs>
+          <w:tab w:val="num" w:pos="6480"/>
+        </w:tabs>
+        <w:ind w:left="6480" w:hanging="360"/>
+      </w:pPr>
+    </w:lvl>
+  </w:abstractNum>
+  <w:abstractNum w:abstractNumId="4" w15:restartNumberingAfterBreak="0">
+    <w:nsid w:val="341B3736"/>
+    <w:multiLevelType w:val="multilevel"/>
+    <w:tmpl w:val="A39AD08C"/>
+    <w:lvl w:ilvl="0">
+      <w:start w:val="1"/>
+      <w:numFmt w:val="decimal"/>
+      <w:lvlText w:val="%1."/>
+      <w:lvlJc w:val="left"/>
+      <w:pPr>
+        <w:tabs>
+          <w:tab w:val="num" w:pos="720"/>
+        </w:tabs>
+        <w:ind w:left="720" w:hanging="360"/>
+      </w:pPr>
+    </w:lvl>
+    <w:lvl w:ilvl="1">
+      <w:start w:val="1"/>
+      <w:numFmt w:val="bullet"/>
+      <w:lvlText w:val="o"/>
+      <w:lvlJc w:val="left"/>
+      <w:pPr>
+        <w:tabs>
+          <w:tab w:val="num" w:pos="1440"/>
+        </w:tabs>
+        <w:ind w:left="1440" w:hanging="360"/>
+      </w:pPr>
+      <w:rPr>
+        <w:rFonts w:ascii="Courier New" w:hAnsi="Courier New" w:hint="default"/>
+        <w:sz w:val="20"/>
+      </w:rPr>
+    </w:lvl>
+    <w:lvl w:ilvl="2" w:tentative="1">
+      <w:start w:val="1"/>
+      <w:numFmt w:val="decimal"/>
+      <w:lvlText w:val="%3."/>
+      <w:lvlJc w:val="left"/>
+      <w:pPr>
+        <w:tabs>
+          <w:tab w:val="num" w:pos="2160"/>
+        </w:tabs>
+        <w:ind w:left="2160" w:hanging="360"/>
+      </w:pPr>
+    </w:lvl>
+    <w:lvl w:ilvl="3" w:tentative="1">
+      <w:start w:val="1"/>
+      <w:numFmt w:val="decimal"/>
+      <w:lvlText w:val="%4."/>
+      <w:lvlJc w:val="left"/>
+      <w:pPr>
+        <w:tabs>
+          <w:tab w:val="num" w:pos="2880"/>
+        </w:tabs>
+        <w:ind w:left="2880" w:hanging="360"/>
+      </w:pPr>
+    </w:lvl>
+    <w:lvl w:ilvl="4" w:tentative="1">
+      <w:start w:val="1"/>
+      <w:numFmt w:val="decimal"/>
+      <w:lvlText w:val="%5."/>
+      <w:lvlJc w:val="left"/>
+      <w:pPr>
+        <w:tabs>
+          <w:tab w:val="num" w:pos="3600"/>
+        </w:tabs>
+        <w:ind w:left="3600" w:hanging="360"/>
+      </w:pPr>
+    </w:lvl>
+    <w:lvl w:ilvl="5" w:tentative="1">
+      <w:start w:val="1"/>
+      <w:numFmt w:val="decimal"/>
+      <w:lvlText w:val="%6."/>
+      <w:lvlJc w:val="left"/>
+      <w:pPr>
+        <w:tabs>
+          <w:tab w:val="num" w:pos="4320"/>
+        </w:tabs>
+        <w:ind w:left="4320" w:hanging="360"/>
+      </w:pPr>
+    </w:lvl>
+    <w:lvl w:ilvl="6" w:tentative="1">
+      <w:start w:val="1"/>
+      <w:numFmt w:val="decimal"/>
+      <w:lvlText w:val="%7."/>
+      <w:lvlJc w:val="left"/>
+      <w:pPr>
+        <w:tabs>
+          <w:tab w:val="num" w:pos="5040"/>
+        </w:tabs>
+        <w:ind w:left="5040" w:hanging="360"/>
+      </w:pPr>
+    </w:lvl>
+    <w:lvl w:ilvl="7" w:tentative="1">
+      <w:start w:val="1"/>
+      <w:numFmt w:val="decimal"/>
+      <w:lvlText w:val="%8."/>
+      <w:lvlJc w:val="left"/>
+      <w:pPr>
+        <w:tabs>
+          <w:tab w:val="num" w:pos="5760"/>
+        </w:tabs>
+        <w:ind w:left="5760" w:hanging="360"/>
+      </w:pPr>
+    </w:lvl>
+    <w:lvl w:ilvl="8" w:tentative="1">
+      <w:start w:val="1"/>
+      <w:numFmt w:val="decimal"/>
+      <w:lvlText w:val="%9."/>
+      <w:lvlJc w:val="left"/>
+      <w:pPr>
+        <w:tabs>
+          <w:tab w:val="num" w:pos="6480"/>
+        </w:tabs>
+        <w:ind w:left="6480" w:hanging="360"/>
+      </w:pPr>
+    </w:lvl>
+  </w:abstractNum>
+  <w:abstractNum w:abstractNumId="5" w15:restartNumberingAfterBreak="0">
     <w:nsid w:val="3D570427"/>
     <w:multiLevelType w:val="multilevel"/>
     <w:tmpl w:val="D40689E0"/>
@@ -1850,7 +3181,7 @@
       </w:pPr>
     </w:lvl>
   </w:abstractNum>
-  <w:abstractNum w:abstractNumId="3" w15:restartNumberingAfterBreak="0">
+  <w:abstractNum w:abstractNumId="6" w15:restartNumberingAfterBreak="0">
     <w:nsid w:val="4F483A01"/>
     <w:multiLevelType w:val="multilevel"/>
     <w:tmpl w:val="CD68C606"/>
@@ -1999,7 +3330,124 @@
       </w:rPr>
     </w:lvl>
   </w:abstractNum>
-  <w:abstractNum w:abstractNumId="4" w15:restartNumberingAfterBreak="0">
+  <w:abstractNum w:abstractNumId="7" w15:restartNumberingAfterBreak="0">
+    <w:nsid w:val="57134D65"/>
+    <w:multiLevelType w:val="multilevel"/>
+    <w:tmpl w:val="9ED61E6C"/>
+    <w:lvl w:ilvl="0">
+      <w:start w:val="1"/>
+      <w:numFmt w:val="decimal"/>
+      <w:lvlText w:val="%1."/>
+      <w:lvlJc w:val="left"/>
+      <w:pPr>
+        <w:tabs>
+          <w:tab w:val="num" w:pos="720"/>
+        </w:tabs>
+        <w:ind w:left="720" w:hanging="360"/>
+      </w:pPr>
+    </w:lvl>
+    <w:lvl w:ilvl="1">
+      <w:start w:val="1"/>
+      <w:numFmt w:val="bullet"/>
+      <w:lvlText w:val="o"/>
+      <w:lvlJc w:val="left"/>
+      <w:pPr>
+        <w:tabs>
+          <w:tab w:val="num" w:pos="1440"/>
+        </w:tabs>
+        <w:ind w:left="1440" w:hanging="360"/>
+      </w:pPr>
+      <w:rPr>
+        <w:rFonts w:ascii="Courier New" w:hAnsi="Courier New" w:hint="default"/>
+        <w:sz w:val="20"/>
+      </w:rPr>
+    </w:lvl>
+    <w:lvl w:ilvl="2" w:tentative="1">
+      <w:start w:val="1"/>
+      <w:numFmt w:val="decimal"/>
+      <w:lvlText w:val="%3."/>
+      <w:lvlJc w:val="left"/>
+      <w:pPr>
+        <w:tabs>
+          <w:tab w:val="num" w:pos="2160"/>
+        </w:tabs>
+        <w:ind w:left="2160" w:hanging="360"/>
+      </w:pPr>
+    </w:lvl>
+    <w:lvl w:ilvl="3" w:tentative="1">
+      <w:start w:val="1"/>
+      <w:numFmt w:val="decimal"/>
+      <w:lvlText w:val="%4."/>
+      <w:lvlJc w:val="left"/>
+      <w:pPr>
+        <w:tabs>
+          <w:tab w:val="num" w:pos="2880"/>
+        </w:tabs>
+        <w:ind w:left="2880" w:hanging="360"/>
+      </w:pPr>
+    </w:lvl>
+    <w:lvl w:ilvl="4" w:tentative="1">
+      <w:start w:val="1"/>
+      <w:numFmt w:val="decimal"/>
+      <w:lvlText w:val="%5."/>
+      <w:lvlJc w:val="left"/>
+      <w:pPr>
+        <w:tabs>
+          <w:tab w:val="num" w:pos="3600"/>
+        </w:tabs>
+        <w:ind w:left="3600" w:hanging="360"/>
+      </w:pPr>
+    </w:lvl>
+    <w:lvl w:ilvl="5" w:tentative="1">
+      <w:start w:val="1"/>
+      <w:numFmt w:val="decimal"/>
+      <w:lvlText w:val="%6."/>
+      <w:lvlJc w:val="left"/>
+      <w:pPr>
+        <w:tabs>
+          <w:tab w:val="num" w:pos="4320"/>
+        </w:tabs>
+        <w:ind w:left="4320" w:hanging="360"/>
+      </w:pPr>
+    </w:lvl>
+    <w:lvl w:ilvl="6" w:tentative="1">
+      <w:start w:val="1"/>
+      <w:numFmt w:val="decimal"/>
+      <w:lvlText w:val="%7."/>
+      <w:lvlJc w:val="left"/>
+      <w:pPr>
+        <w:tabs>
+          <w:tab w:val="num" w:pos="5040"/>
+        </w:tabs>
+        <w:ind w:left="5040" w:hanging="360"/>
+      </w:pPr>
+    </w:lvl>
+    <w:lvl w:ilvl="7" w:tentative="1">
+      <w:start w:val="1"/>
+      <w:numFmt w:val="decimal"/>
+      <w:lvlText w:val="%8."/>
+      <w:lvlJc w:val="left"/>
+      <w:pPr>
+        <w:tabs>
+          <w:tab w:val="num" w:pos="5760"/>
+        </w:tabs>
+        <w:ind w:left="5760" w:hanging="360"/>
+      </w:pPr>
+    </w:lvl>
+    <w:lvl w:ilvl="8" w:tentative="1">
+      <w:start w:val="1"/>
+      <w:numFmt w:val="decimal"/>
+      <w:lvlText w:val="%9."/>
+      <w:lvlJc w:val="left"/>
+      <w:pPr>
+        <w:tabs>
+          <w:tab w:val="num" w:pos="6480"/>
+        </w:tabs>
+        <w:ind w:left="6480" w:hanging="360"/>
+      </w:pPr>
+    </w:lvl>
+  </w:abstractNum>
+  <w:abstractNum w:abstractNumId="8" w15:restartNumberingAfterBreak="0">
     <w:nsid w:val="598C28CE"/>
     <w:multiLevelType w:val="multilevel"/>
     <w:tmpl w:val="2A44C3BC"/>
@@ -2116,7 +3564,7 @@
       </w:pPr>
     </w:lvl>
   </w:abstractNum>
-  <w:abstractNum w:abstractNumId="5" w15:restartNumberingAfterBreak="0">
+  <w:abstractNum w:abstractNumId="9" w15:restartNumberingAfterBreak="0">
     <w:nsid w:val="5C1B3961"/>
     <w:multiLevelType w:val="multilevel"/>
     <w:tmpl w:val="F7867A8A"/>
@@ -2233,7 +3681,7 @@
       </w:pPr>
     </w:lvl>
   </w:abstractNum>
-  <w:abstractNum w:abstractNumId="6" w15:restartNumberingAfterBreak="0">
+  <w:abstractNum w:abstractNumId="10" w15:restartNumberingAfterBreak="0">
     <w:nsid w:val="6D9539A9"/>
     <w:multiLevelType w:val="multilevel"/>
     <w:tmpl w:val="8340A374"/>
@@ -2350,7 +3798,7 @@
       </w:pPr>
     </w:lvl>
   </w:abstractNum>
-  <w:abstractNum w:abstractNumId="7" w15:restartNumberingAfterBreak="0">
+  <w:abstractNum w:abstractNumId="11" w15:restartNumberingAfterBreak="0">
     <w:nsid w:val="6DB34867"/>
     <w:multiLevelType w:val="multilevel"/>
     <w:tmpl w:val="AA365B4A"/>
@@ -2463,29 +3911,193 @@
       </w:pPr>
     </w:lvl>
   </w:abstractNum>
+  <w:abstractNum w:abstractNumId="12" w15:restartNumberingAfterBreak="0">
+    <w:nsid w:val="78C160B8"/>
+    <w:multiLevelType w:val="multilevel"/>
+    <w:tmpl w:val="614288B6"/>
+    <w:lvl w:ilvl="0">
+      <w:start w:val="1"/>
+      <w:numFmt w:val="bullet"/>
+      <w:lvlText w:val=""/>
+      <w:lvlJc w:val="left"/>
+      <w:pPr>
+        <w:tabs>
+          <w:tab w:val="num" w:pos="720"/>
+        </w:tabs>
+        <w:ind w:left="720" w:hanging="360"/>
+      </w:pPr>
+      <w:rPr>
+        <w:rFonts w:ascii="Symbol" w:hAnsi="Symbol" w:hint="default"/>
+        <w:sz w:val="20"/>
+      </w:rPr>
+    </w:lvl>
+    <w:lvl w:ilvl="1" w:tentative="1">
+      <w:start w:val="1"/>
+      <w:numFmt w:val="bullet"/>
+      <w:lvlText w:val="o"/>
+      <w:lvlJc w:val="left"/>
+      <w:pPr>
+        <w:tabs>
+          <w:tab w:val="num" w:pos="1440"/>
+        </w:tabs>
+        <w:ind w:left="1440" w:hanging="360"/>
+      </w:pPr>
+      <w:rPr>
+        <w:rFonts w:ascii="Courier New" w:hAnsi="Courier New" w:hint="default"/>
+        <w:sz w:val="20"/>
+      </w:rPr>
+    </w:lvl>
+    <w:lvl w:ilvl="2" w:tentative="1">
+      <w:start w:val="1"/>
+      <w:numFmt w:val="bullet"/>
+      <w:lvlText w:val=""/>
+      <w:lvlJc w:val="left"/>
+      <w:pPr>
+        <w:tabs>
+          <w:tab w:val="num" w:pos="2160"/>
+        </w:tabs>
+        <w:ind w:left="2160" w:hanging="360"/>
+      </w:pPr>
+      <w:rPr>
+        <w:rFonts w:ascii="Wingdings" w:hAnsi="Wingdings" w:hint="default"/>
+        <w:sz w:val="20"/>
+      </w:rPr>
+    </w:lvl>
+    <w:lvl w:ilvl="3" w:tentative="1">
+      <w:start w:val="1"/>
+      <w:numFmt w:val="bullet"/>
+      <w:lvlText w:val=""/>
+      <w:lvlJc w:val="left"/>
+      <w:pPr>
+        <w:tabs>
+          <w:tab w:val="num" w:pos="2880"/>
+        </w:tabs>
+        <w:ind w:left="2880" w:hanging="360"/>
+      </w:pPr>
+      <w:rPr>
+        <w:rFonts w:ascii="Wingdings" w:hAnsi="Wingdings" w:hint="default"/>
+        <w:sz w:val="20"/>
+      </w:rPr>
+    </w:lvl>
+    <w:lvl w:ilvl="4" w:tentative="1">
+      <w:start w:val="1"/>
+      <w:numFmt w:val="bullet"/>
+      <w:lvlText w:val=""/>
+      <w:lvlJc w:val="left"/>
+      <w:pPr>
+        <w:tabs>
+          <w:tab w:val="num" w:pos="3600"/>
+        </w:tabs>
+        <w:ind w:left="3600" w:hanging="360"/>
+      </w:pPr>
+      <w:rPr>
+        <w:rFonts w:ascii="Wingdings" w:hAnsi="Wingdings" w:hint="default"/>
+        <w:sz w:val="20"/>
+      </w:rPr>
+    </w:lvl>
+    <w:lvl w:ilvl="5" w:tentative="1">
+      <w:start w:val="1"/>
+      <w:numFmt w:val="bullet"/>
+      <w:lvlText w:val=""/>
+      <w:lvlJc w:val="left"/>
+      <w:pPr>
+        <w:tabs>
+          <w:tab w:val="num" w:pos="4320"/>
+        </w:tabs>
+        <w:ind w:left="4320" w:hanging="360"/>
+      </w:pPr>
+      <w:rPr>
+        <w:rFonts w:ascii="Wingdings" w:hAnsi="Wingdings" w:hint="default"/>
+        <w:sz w:val="20"/>
+      </w:rPr>
+    </w:lvl>
+    <w:lvl w:ilvl="6" w:tentative="1">
+      <w:start w:val="1"/>
+      <w:numFmt w:val="bullet"/>
+      <w:lvlText w:val=""/>
+      <w:lvlJc w:val="left"/>
+      <w:pPr>
+        <w:tabs>
+          <w:tab w:val="num" w:pos="5040"/>
+        </w:tabs>
+        <w:ind w:left="5040" w:hanging="360"/>
+      </w:pPr>
+      <w:rPr>
+        <w:rFonts w:ascii="Wingdings" w:hAnsi="Wingdings" w:hint="default"/>
+        <w:sz w:val="20"/>
+      </w:rPr>
+    </w:lvl>
+    <w:lvl w:ilvl="7" w:tentative="1">
+      <w:start w:val="1"/>
+      <w:numFmt w:val="bullet"/>
+      <w:lvlText w:val=""/>
+      <w:lvlJc w:val="left"/>
+      <w:pPr>
+        <w:tabs>
+          <w:tab w:val="num" w:pos="5760"/>
+        </w:tabs>
+        <w:ind w:left="5760" w:hanging="360"/>
+      </w:pPr>
+      <w:rPr>
+        <w:rFonts w:ascii="Wingdings" w:hAnsi="Wingdings" w:hint="default"/>
+        <w:sz w:val="20"/>
+      </w:rPr>
+    </w:lvl>
+    <w:lvl w:ilvl="8" w:tentative="1">
+      <w:start w:val="1"/>
+      <w:numFmt w:val="bullet"/>
+      <w:lvlText w:val=""/>
+      <w:lvlJc w:val="left"/>
+      <w:pPr>
+        <w:tabs>
+          <w:tab w:val="num" w:pos="6480"/>
+        </w:tabs>
+        <w:ind w:left="6480" w:hanging="360"/>
+      </w:pPr>
+      <w:rPr>
+        <w:rFonts w:ascii="Wingdings" w:hAnsi="Wingdings" w:hint="default"/>
+        <w:sz w:val="20"/>
+      </w:rPr>
+    </w:lvl>
+  </w:abstractNum>
   <w:num w:numId="1">
-    <w:abstractNumId w:val="3"/>
+    <w:abstractNumId w:val="6"/>
   </w:num>
   <w:num w:numId="2">
+    <w:abstractNumId w:val="8"/>
+  </w:num>
+  <w:num w:numId="3">
+    <w:abstractNumId w:val="9"/>
+  </w:num>
+  <w:num w:numId="4">
+    <w:abstractNumId w:val="1"/>
+  </w:num>
+  <w:num w:numId="5">
+    <w:abstractNumId w:val="2"/>
+  </w:num>
+  <w:num w:numId="6">
+    <w:abstractNumId w:val="5"/>
+  </w:num>
+  <w:num w:numId="7">
+    <w:abstractNumId w:val="10"/>
+  </w:num>
+  <w:num w:numId="8">
+    <w:abstractNumId w:val="11"/>
+  </w:num>
+  <w:num w:numId="9">
+    <w:abstractNumId w:val="12"/>
+  </w:num>
+  <w:num w:numId="10">
     <w:abstractNumId w:val="4"/>
   </w:num>
-  <w:num w:numId="3">
-    <w:abstractNumId w:val="5"/>
-  </w:num>
-  <w:num w:numId="4">
+  <w:num w:numId="11">
     <w:abstractNumId w:val="0"/>
   </w:num>
-  <w:num w:numId="5">
-    <w:abstractNumId w:val="1"/>
+  <w:num w:numId="12">
+    <w:abstractNumId w:val="7"/>
   </w:num>
-  <w:num w:numId="6">
-    <w:abstractNumId w:val="2"/>
-  </w:num>
-  <w:num w:numId="7">
-    <w:abstractNumId w:val="6"/>
-  </w:num>
-  <w:num w:numId="8">
-    <w:abstractNumId w:val="7"/>
+  <w:num w:numId="13">
+    <w:abstractNumId w:val="3"/>
   </w:num>
 </w:numbering>
 </file>

</xml_diff>

<commit_message>
Login credentials added in documentation
</commit_message>
<xml_diff>
--- a/VALID8_DOCKER_FINAL/📦 Deployment Guide for Docker.docx
+++ b/VALID8_DOCKER_FINAL/📦 Deployment Guide for Docker.docx
@@ -172,7 +172,7 @@
           <w:sz w:val="28"/>
         </w:rPr>
         <w:pict>
-          <v:rect id="_x0000_i1041" style="width:0;height:1.5pt" o:hralign="center" o:hrstd="t" o:hr="t" fillcolor="#a0a0a0" stroked="f"/>
+          <v:rect id="_x0000_i1025" style="width:0;height:1.5pt" o:hralign="center" o:hrstd="t" o:hr="t" fillcolor="#a0a0a0" stroked="f"/>
         </w:pict>
       </w:r>
     </w:p>
@@ -440,7 +440,7 @@
           <w:sz w:val="28"/>
         </w:rPr>
         <w:pict>
-          <v:rect id="_x0000_i1042" style="width:0;height:1.5pt" o:hralign="center" o:hrstd="t" o:hr="t" fillcolor="#a0a0a0" stroked="f"/>
+          <v:rect id="_x0000_i1026" style="width:0;height:1.5pt" o:hralign="center" o:hrstd="t" o:hr="t" fillcolor="#a0a0a0" stroked="f"/>
         </w:pict>
       </w:r>
     </w:p>
@@ -584,7 +584,7 @@
           <w:sz w:val="28"/>
         </w:rPr>
         <w:pict>
-          <v:rect id="_x0000_i1043" style="width:0;height:1.5pt" o:hralign="center" o:hrstd="t" o:hr="t" fillcolor="#a0a0a0" stroked="f"/>
+          <v:rect id="_x0000_i1027" style="width:0;height:1.5pt" o:hralign="center" o:hrstd="t" o:hr="t" fillcolor="#a0a0a0" stroked="f"/>
         </w:pict>
       </w:r>
     </w:p>
@@ -741,7 +741,7 @@
           <w:sz w:val="28"/>
         </w:rPr>
         <w:pict>
-          <v:rect id="_x0000_i1044" style="width:0;height:1.5pt" o:hralign="center" o:hrstd="t" o:hr="t" fillcolor="#a0a0a0" stroked="f"/>
+          <v:rect id="_x0000_i1028" style="width:0;height:1.5pt" o:hralign="center" o:hrstd="t" o:hr="t" fillcolor="#a0a0a0" stroked="f"/>
         </w:pict>
       </w:r>
     </w:p>
@@ -1130,7 +1130,7 @@
           <w:sz w:val="28"/>
         </w:rPr>
         <w:pict>
-          <v:rect id="_x0000_i1045" style="width:0;height:1.5pt" o:hralign="center" o:hrstd="t" o:hr="t" fillcolor="#a0a0a0" stroked="f"/>
+          <v:rect id="_x0000_i1029" style="width:0;height:1.5pt" o:hralign="center" o:hrstd="t" o:hr="t" fillcolor="#a0a0a0" stroked="f"/>
         </w:pict>
       </w:r>
     </w:p>
@@ -1297,7 +1297,7 @@
           <w:sz w:val="28"/>
         </w:rPr>
         <w:pict>
-          <v:rect id="_x0000_i1046" style="width:0;height:1.5pt" o:hralign="center" o:hrstd="t" o:hr="t" fillcolor="#a0a0a0" stroked="f"/>
+          <v:rect id="_x0000_i1030" style="width:0;height:1.5pt" o:hralign="center" o:hrstd="t" o:hr="t" fillcolor="#a0a0a0" stroked="f"/>
         </w:pict>
       </w:r>
     </w:p>
@@ -1720,7 +1720,7 @@
           <w:sz w:val="28"/>
         </w:rPr>
         <w:pict>
-          <v:rect id="_x0000_i1047" style="width:0;height:1.5pt" o:hralign="center" o:hrstd="t" o:hr="t" fillcolor="#a0a0a0" stroked="f"/>
+          <v:rect id="_x0000_i1031" style="width:0;height:1.5pt" o:hralign="center" o:hrstd="t" o:hr="t" fillcolor="#a0a0a0" stroked="f"/>
         </w:pict>
       </w:r>
     </w:p>
@@ -1826,7 +1826,7 @@
           <w:sz w:val="28"/>
         </w:rPr>
         <w:pict>
-          <v:rect id="_x0000_i1048" style="width:0;height:1.5pt" o:hralign="center" o:hrstd="t" o:hr="t" fillcolor="#a0a0a0" stroked="f"/>
+          <v:rect id="_x0000_i1032" style="width:0;height:1.5pt" o:hralign="center" o:hrstd="t" o:hr="t" fillcolor="#a0a0a0" stroked="f"/>
         </w:pict>
       </w:r>
     </w:p>
@@ -2320,8 +2320,6 @@
         </w:rPr>
         <w:t>"New Admin"</w:t>
       </w:r>
-      <w:bookmarkStart w:id="0" w:name="_GoBack"/>
-      <w:bookmarkEnd w:id="0"/>
     </w:p>
     <w:p>
       <w:pPr>
@@ -2386,8 +2384,11 @@
           <w:numId w:val="13"/>
         </w:numPr>
         <w:rPr>
-          <w:sz w:val="28"/>
-          <w:szCs w:val="28"/>
+          <w:rStyle w:val="Hyperlink"/>
+          <w:color w:val="auto"/>
+          <w:sz w:val="28"/>
+          <w:szCs w:val="28"/>
+          <w:u w:val="none"/>
         </w:rPr>
       </w:pPr>
       <w:r>
@@ -2433,11 +2434,222 @@
     </w:p>
     <w:p>
       <w:pPr>
-        <w:rPr>
-          <w:rFonts w:ascii="Times New Roman" w:hAnsi="Times New Roman" w:cs="Times New Roman"/>
-          <w:sz w:val="28"/>
-        </w:rPr>
-      </w:pPr>
+        <w:pStyle w:val="NormalWeb"/>
+        <w:rPr>
+          <w:rStyle w:val="Hyperlink"/>
+          <w:color w:val="auto"/>
+          <w:sz w:val="28"/>
+          <w:szCs w:val="28"/>
+          <w:u w:val="none"/>
+        </w:rPr>
+      </w:pPr>
+    </w:p>
+    <w:p>
+      <w:pPr>
+        <w:pStyle w:val="NormalWeb"/>
+        <w:rPr>
+          <w:rStyle w:val="Hyperlink"/>
+          <w:b/>
+          <w:color w:val="auto"/>
+          <w:sz w:val="28"/>
+          <w:szCs w:val="28"/>
+          <w:u w:val="none"/>
+        </w:rPr>
+      </w:pPr>
+      <w:r>
+        <w:rPr>
+          <w:rStyle w:val="Hyperlink"/>
+          <w:b/>
+          <w:color w:val="auto"/>
+          <w:sz w:val="28"/>
+          <w:szCs w:val="28"/>
+          <w:u w:val="none"/>
+        </w:rPr>
+        <w:lastRenderedPageBreak/>
+        <w:t>Login Credentials</w:t>
+      </w:r>
+    </w:p>
+    <w:tbl>
+      <w:tblPr>
+        <w:tblStyle w:val="TableGrid"/>
+        <w:tblW w:w="0" w:type="auto"/>
+        <w:tblLook w:val="04A0" w:firstRow="1" w:lastRow="0" w:firstColumn="1" w:lastColumn="0" w:noHBand="0" w:noVBand="1"/>
+      </w:tblPr>
+      <w:tblGrid>
+        <w:gridCol w:w="5057"/>
+        <w:gridCol w:w="4293"/>
+      </w:tblGrid>
+      <w:tr>
+        <w:tc>
+          <w:tcPr>
+            <w:tcW w:w="5057" w:type="dxa"/>
+          </w:tcPr>
+          <w:p>
+            <w:pPr>
+              <w:pStyle w:val="NormalWeb"/>
+              <w:rPr>
+                <w:rStyle w:val="Hyperlink"/>
+                <w:b/>
+                <w:color w:val="auto"/>
+                <w:sz w:val="28"/>
+                <w:szCs w:val="28"/>
+                <w:u w:val="none"/>
+              </w:rPr>
+            </w:pPr>
+            <w:r>
+              <w:rPr>
+                <w:rStyle w:val="Hyperlink"/>
+                <w:b/>
+                <w:color w:val="auto"/>
+                <w:sz w:val="28"/>
+                <w:szCs w:val="28"/>
+                <w:u w:val="none"/>
+              </w:rPr>
+              <w:t>User Configuration for Seeding</w:t>
+            </w:r>
+          </w:p>
+        </w:tc>
+        <w:tc>
+          <w:tcPr>
+            <w:tcW w:w="4293" w:type="dxa"/>
+          </w:tcPr>
+          <w:p>
+            <w:pPr>
+              <w:pStyle w:val="NormalWeb"/>
+              <w:rPr>
+                <w:rStyle w:val="Hyperlink"/>
+                <w:b/>
+                <w:color w:val="auto"/>
+                <w:sz w:val="28"/>
+                <w:szCs w:val="28"/>
+                <w:u w:val="none"/>
+              </w:rPr>
+            </w:pPr>
+          </w:p>
+        </w:tc>
+      </w:tr>
+      <w:tr>
+        <w:tc>
+          <w:tcPr>
+            <w:tcW w:w="5057" w:type="dxa"/>
+          </w:tcPr>
+          <w:p>
+            <w:pPr>
+              <w:pStyle w:val="NormalWeb"/>
+              <w:rPr>
+                <w:rStyle w:val="Hyperlink"/>
+                <w:color w:val="auto"/>
+                <w:sz w:val="28"/>
+                <w:szCs w:val="28"/>
+                <w:u w:val="none"/>
+              </w:rPr>
+            </w:pPr>
+            <w:r>
+              <w:rPr>
+                <w:rStyle w:val="Hyperlink"/>
+                <w:color w:val="auto"/>
+                <w:sz w:val="28"/>
+                <w:szCs w:val="28"/>
+                <w:u w:val="none"/>
+              </w:rPr>
+              <w:t>Admin email:</w:t>
+            </w:r>
+          </w:p>
+        </w:tc>
+        <w:tc>
+          <w:tcPr>
+            <w:tcW w:w="4293" w:type="dxa"/>
+          </w:tcPr>
+          <w:p>
+            <w:pPr>
+              <w:pStyle w:val="NormalWeb"/>
+              <w:rPr>
+                <w:rStyle w:val="Hyperlink"/>
+                <w:color w:val="auto"/>
+                <w:sz w:val="28"/>
+                <w:szCs w:val="28"/>
+                <w:u w:val="none"/>
+              </w:rPr>
+            </w:pPr>
+            <w:hyperlink r:id="rId11" w:history="1">
+              <w:r>
+                <w:rPr>
+                  <w:rStyle w:val="Hyperlink"/>
+                  <w:sz w:val="28"/>
+                  <w:szCs w:val="28"/>
+                </w:rPr>
+                <w:t>admin@university.edu</w:t>
+              </w:r>
+            </w:hyperlink>
+          </w:p>
+        </w:tc>
+      </w:tr>
+      <w:tr>
+        <w:tc>
+          <w:tcPr>
+            <w:tcW w:w="5057" w:type="dxa"/>
+          </w:tcPr>
+          <w:p>
+            <w:pPr>
+              <w:pStyle w:val="NormalWeb"/>
+              <w:rPr>
+                <w:rStyle w:val="Hyperlink"/>
+                <w:color w:val="auto"/>
+                <w:sz w:val="28"/>
+                <w:szCs w:val="28"/>
+                <w:u w:val="none"/>
+              </w:rPr>
+            </w:pPr>
+            <w:r>
+              <w:rPr>
+                <w:rStyle w:val="Hyperlink"/>
+                <w:color w:val="auto"/>
+                <w:sz w:val="28"/>
+                <w:szCs w:val="28"/>
+                <w:u w:val="none"/>
+              </w:rPr>
+              <w:t>Admin password:</w:t>
+            </w:r>
+          </w:p>
+        </w:tc>
+        <w:tc>
+          <w:tcPr>
+            <w:tcW w:w="4293" w:type="dxa"/>
+          </w:tcPr>
+          <w:p>
+            <w:pPr>
+              <w:pStyle w:val="NormalWeb"/>
+              <w:rPr>
+                <w:rStyle w:val="Hyperlink"/>
+                <w:color w:val="auto"/>
+                <w:sz w:val="28"/>
+                <w:szCs w:val="28"/>
+                <w:u w:val="none"/>
+              </w:rPr>
+            </w:pPr>
+            <w:r>
+              <w:rPr>
+                <w:rStyle w:val="Hyperlink"/>
+                <w:color w:val="auto"/>
+                <w:sz w:val="28"/>
+                <w:szCs w:val="28"/>
+                <w:u w:val="none"/>
+              </w:rPr>
+              <w:t>AdminPass123!</w:t>
+            </w:r>
+          </w:p>
+        </w:tc>
+      </w:tr>
+    </w:tbl>
+    <w:p>
+      <w:pPr>
+        <w:rPr>
+          <w:rFonts w:ascii="Times New Roman" w:hAnsi="Times New Roman" w:cs="Times New Roman"/>
+          <w:sz w:val="28"/>
+        </w:rPr>
+      </w:pPr>
+      <w:bookmarkStart w:id="0" w:name="_GoBack"/>
+      <w:bookmarkEnd w:id="0"/>
     </w:p>
     <w:sectPr>
       <w:pgSz w:w="12240" w:h="15840"/>
@@ -4809,6 +5021,25 @@
     <w:basedOn w:val="DefaultParagraphFont"/>
     <w:rsid w:val="005F1F72"/>
   </w:style>
+  <w:style w:type="table" w:styleId="TableGrid">
+    <w:name w:val="Table Grid"/>
+    <w:basedOn w:val="TableNormal"/>
+    <w:uiPriority w:val="39"/>
+    <w:rsid w:val="00926F14"/>
+    <w:pPr>
+      <w:spacing w:after="0" w:line="240" w:lineRule="auto"/>
+    </w:pPr>
+    <w:tblPr>
+      <w:tblBorders>
+        <w:top w:val="single" w:sz="4" w:space="0" w:color="auto"/>
+        <w:left w:val="single" w:sz="4" w:space="0" w:color="auto"/>
+        <w:bottom w:val="single" w:sz="4" w:space="0" w:color="auto"/>
+        <w:right w:val="single" w:sz="4" w:space="0" w:color="auto"/>
+        <w:insideH w:val="single" w:sz="4" w:space="0" w:color="auto"/>
+        <w:insideV w:val="single" w:sz="4" w:space="0" w:color="auto"/>
+      </w:tblBorders>
+    </w:tblPr>
+  </w:style>
 </w:styles>
 </file>
 

</xml_diff>